<commit_message>
Padroniza o nome oficial da escola (Escola Municipal Domitila Castelo da Silva) conforme o relatório da Secretaria
Co-Authored-By: Claude Opus 5.5 <noreply@anthropic.com>
Claude-Session: https://claude.ai/code/session_01HxStpW4pQoDfJdTDYr6zEC
</commit_message>
<xml_diff>
--- a/introducao_nova/1_INTRODUCAO_alinhada_ao_projeto.docx
+++ b/introducao_nova/1_INTRODUCAO_alinhada_ao_projeto.docx
@@ -135,7 +135,7 @@
           <w:b w:val="0"/>
           <w:i w:val="0"/>
         </w:rPr>
-        <w:t>Delimitada essa escala, é preciso explicitar o percurso de uma lei até a escola. Entre o texto oficial e o cotidiano escolar, as orientações encontram pessoas, limites institucionais, recursos desiguais e dinâmicas do território, e todos esses elementos interferem no modo como a norma ganha forma. Tomamos, então, a política como processo, com base na Abordagem do Ciclo de Políticas (ACP), formulada por Bowe, Ball e Gold (1992). Ao descreverem o contexto da prática, os autores afirmam: “a política não é simplesmente recebida e implementada nesta arena, ao contrário, ela está sujeita à interpretação e então é ‘recriada’” (BOWE; BALL; GOLD, 1992, p. 22, tradução nossa). Mainardes (2006, p. 52), ao sistematizar a ACP para a pesquisa educacional brasileira, explicita a consequência desse movimento: “o contexto da prática é onde a política está sujeita à interpretação e recriação e onde a política produz efeitos e conseqüências que podem representar mudanças e transformações significativas na política original”. Para esta pesquisa, a formulação tem um sentido preciso. Ao chegar à Escola Municipal Domitila Castelo, o eixo Educação Digital Escolar será lido, adaptado e, possivelmente, transformado por quem trabalha nela, e a análise precisa acompanhar essas transformações sem tratá-las, de antemão, como desvio.</w:t>
+        <w:t xml:space="preserve">Delimitada essa escala, é preciso explicitar o percurso de uma lei até a escola. Entre o texto oficial e o cotidiano escolar, as orientações encontram pessoas, limites institucionais, recursos desiguais e dinâmicas do território, e todos esses elementos interferem no modo como a norma ganha forma. Tomamos, então, a política como processo, com base na Abordagem do Ciclo de Políticas (ACP), formulada por Bowe, Ball e Gold (1992). Ao descreverem o contexto da prática, os autores afirmam: “a política não é simplesmente recebida e implementada nesta arena, ao contrário, ela está sujeita à interpretação e então é ‘recriada’” (BOWE; BALL; GOLD, 1992, p. 22, tradução nossa). Mainardes (2006, p. 52), ao sistematizar a ACP para a pesquisa educacional brasileira, explicita a consequência desse movimento: “o contexto da prática é onde a política está sujeita à interpretação e recriação e onde a política produz efeitos e conseqüências que podem representar mudanças e transformações significativas na política original”. Para esta pesquisa, a formulação tem um sentido preciso. Ao chegar à Escola Municipal Domitila Castelo da Silva, o eixo Educação Digital Escolar será lido, adaptado e, possivelmente, transformado por quem trabalha nela, e a análise precisa acompanhar essas transformações sem tratá-las, de antemão, como desvio.</w:t>
       </w:r>
     </w:p>
     <w:p>
@@ -247,7 +247,7 @@
           <w:b w:val="0"/>
           <w:i w:val="0"/>
         </w:rPr>
-        <w:t>Com esse recorte, definimos o objeto desta pesquisa: a encenação da Política Nacional de Educação Digital, em seu eixo Educação Digital Escolar, pelos profissionais da educação que atuam nos anos iniciais do Ensino Fundamental, do 1º ao 5º ano, na Escola Municipal Domitila Castelo, em Pipa, distrito de Tibau do Sul, no litoral sul do Rio Grande do Norte. Chamamos de profissionais da educação as professoras e os professores do 1º ao 5º ano, a coordenação pedagógica, a direção e os demais profissionais ligados aos processos pedagógicos ou à educação digital. Interessam-nos os modos pelos quais a política é interpretada, traduzida e recontextualizada no contexto da prática, bem como o peso que têm nesse processo as culturas profissionais, as condições materiais e institucionais da escola e as especificidades socioespaciais do lugar onde ela está. O território, o funcionamento da escola e as condições de infraestrutura entram, assim, na análise como dimensões do contexto da prática, e as narrativas dos profissionais constituem o principal caminho para compreender como a política ganha forma no cotidiano escolar.</w:t>
+        <w:t xml:space="preserve">Com esse recorte, definimos o objeto desta pesquisa: a encenação da Política Nacional de Educação Digital, em seu eixo Educação Digital Escolar, pelos profissionais da educação que atuam nos anos iniciais do Ensino Fundamental, do 1º ao 5º ano, na Escola Municipal Domitila Castelo da Silva, em Pipa, distrito de Tibau do Sul, no litoral sul do Rio Grande do Norte. Chamamos de profissionais da educação as professoras e os professores do 1º ao 5º ano, a coordenação pedagógica, a direção e os demais profissionais ligados aos processos pedagógicos ou à educação digital. Interessam-nos os modos pelos quais a política é interpretada, traduzida e recontextualizada no contexto da prática, bem como o peso que têm nesse processo as culturas profissionais, as condições materiais e institucionais da escola e as especificidades socioespaciais do lugar onde ela está. O território, o funcionamento da escola e as condições de infraestrutura entram, assim, na análise como dimensões do contexto da prática, e as narrativas dos profissionais constituem o principal caminho para compreender como a política ganha forma no cotidiano escolar.</w:t>
       </w:r>
     </w:p>
     <w:p>
@@ -594,7 +594,7 @@
           <w:b w:val="0"/>
           <w:i w:val="0"/>
         </w:rPr>
-        <w:t>Desse percurso nasce a questão que orienta a investigação: como os profissionais da educação encenam e recontextualizam a Política Nacional de Educação Digital no contexto da prática da Escola Municipal Domitila Castelo, em Pipa (RN), e como as culturas profissionais, as condições materiais e institucionais da escola e as especificidades socioespaciais do território atravessam esse processo, produzindo diferentes formas de atuação, entre as quais podem emergir acomodações, negociações, ressignificações e resistências?</w:t>
+        <w:t xml:space="preserve">Desse percurso nasce a questão que orienta a investigação: como os profissionais da educação encenam e recontextualizam a Política Nacional de Educação Digital no contexto da prática da Escola Municipal Domitila Castelo da Silva, em Pipa (RN), e como as culturas profissionais, as condições materiais e institucionais da escola e as especificidades socioespaciais do território atravessam esse processo, produzindo diferentes formas de atuação, entre as quais podem emergir acomodações, negociações, ressignificações e resistências?</w:t>
       </w:r>
     </w:p>
     <w:p>
@@ -622,7 +622,7 @@
           <w:b w:val="0"/>
           <w:i w:val="0"/>
         </w:rPr>
-        <w:t>O objetivo geral é analisar como os profissionais da educação encenam e recontextualizam a Política Nacional de Educação Digital no contexto da prática da Escola Municipal Domitila Castelo, em Pipa (RN), considerando as relações entre a política, as culturas profissionais, as condições materiais e institucionais da escola e as especificidades socioespaciais do território. São objetivos específicos:</w:t>
+        <w:t xml:space="preserve">O objetivo geral é analisar como os profissionais da educação encenam e recontextualizam a Política Nacional de Educação Digital no contexto da prática da Escola Municipal Domitila Castelo da Silva, em Pipa (RN), considerando as relações entre a política, as culturas profissionais, as condições materiais e institucionais da escola e as especificidades socioespaciais do território. São objetivos específicos:</w:t>
       </w:r>
     </w:p>
     <w:p>
@@ -784,7 +784,7 @@
           <w:b w:val="0"/>
           <w:i w:val="0"/>
         </w:rPr>
-        <w:t>Participam os profissionais da educação que atuam nos anos iniciais da escola e aceitarem o convite: docentes do 1º ao 5º ano, coordenação pedagógica, direção e demais profissionais ligados aos processos pedagógicos ou à educação digital [indicar o número de participantes por função]. Participa também um técnico da Secretaria Municipal de Educação ligado às ações de educação digital no município. Sua escuta é fonte complementar sobre o contexto externo, isto é, sobre como as orientações nacionais são recebidas e encaminhadas pela gestão municipal antes de chegar à escola, e a unidade do estudo permanece na encenação da PNED na Escola Municipal Domitila Castelo.</w:t>
+        <w:t xml:space="preserve">Participam os profissionais da educação que atuam nos anos iniciais da escola e aceitarem o convite: docentes do 1º ao 5º ano, coordenação pedagógica, direção e demais profissionais ligados aos processos pedagógicos ou à educação digital [indicar o número de participantes por função]. Participa também um técnico da Secretaria Municipal de Educação ligado às ações de educação digital no município. Sua escuta é fonte complementar sobre o contexto externo, isto é, sobre como as orientações nacionais são recebidas e encaminhadas pela gestão municipal antes de chegar à escola, e a unidade do estudo permanece na encenação da PNED na Escola Municipal Domitila Castelo da Silva.</w:t>
       </w:r>
     </w:p>
     <w:p>
@@ -2133,6 +2133,7 @@
     </w:p>
     <w:sectPr>
       <w:headerReference w:type="default" r:id="rId9"/>
+      <w:footerReference w:type="default" r:id="rId10"/>
       <w:pgSz w:w="11906" w:h="16838"/>
       <w:pgMar w:top="1701" w:right="1134" w:bottom="1134" w:left="1701" w:header="1134" w:footer="720" w:gutter="0"/>
       <w:cols w:space="720"/>
@@ -2140,6 +2141,16 @@
     </w:sectPr>
   </w:body>
 </w:document>
+</file>
+
+<file path=word/footer1.xml><?xml version="1.0" encoding="utf-8"?>
+<w:ftr xmlns:m="http://schemas.openxmlformats.org/officeDocument/2006/math" xmlns:mc="http://schemas.openxmlformats.org/markup-compatibility/2006" xmlns:mo="http://schemas.microsoft.com/office/mac/office/2008/main" xmlns:mv="urn:schemas-microsoft-com:mac:vml" xmlns:o="urn:schemas-microsoft-com:office:office" xmlns:r="http://schemas.openxmlformats.org/officeDocument/2006/relationships" xmlns:v="urn:schemas-microsoft-com:vml" xmlns:w10="urn:schemas-microsoft-com:office:word" xmlns:w14="http://schemas.microsoft.com/office/word/2010/wordml" xmlns:w="http://schemas.openxmlformats.org/wordprocessingml/2006/main" xmlns:wne="http://schemas.microsoft.com/office/word/2006/wordml" xmlns:wp14="http://schemas.microsoft.com/office/word/2010/wordprocessingDrawing" xmlns:wp="http://schemas.openxmlformats.org/drawingml/2006/wordprocessingDrawing" xmlns:wpc="http://schemas.microsoft.com/office/word/2010/wordprocessingCanvas" xmlns:wpg="http://schemas.microsoft.com/office/word/2010/wordprocessingGroup" xmlns:wpi="http://schemas.microsoft.com/office/word/2010/wordprocessingInk" xmlns:wps="http://schemas.microsoft.com/office/word/2010/wordprocessingShape" mc:Ignorable="w14 wp14">
+  <w:p>
+    <w:pPr>
+      <w:pStyle w:val="Footer"/>
+    </w:pPr>
+  </w:p>
+</w:ftr>
 </file>
 
 <file path=word/header1.xml><?xml version="1.0" encoding="utf-8"?>

</xml_diff>

<commit_message>
Introdução alinhada à proposta revisada: base teórica conferida, Aires, Foucault, habitar com Di Felice e páginas corrigidas
Co-Authored-By: Claude Opus 5.5 <noreply@anthropic.com>
Claude-Session: https://claude.ai/code/session_01HxStpW4pQoDfJdTDYr6zEC
</commit_message>
<xml_diff>
--- a/introducao_nova/1_INTRODUCAO_alinhada_ao_projeto.docx
+++ b/introducao_nova/1_INTRODUCAO_alinhada_ao_projeto.docx
@@ -18,11 +18,8 @@
         <w:jc w:val="both"/>
       </w:pPr>
       <w:r>
-        <w:rPr>
-          <w:b w:val="0"/>
-          <w:i w:val="0"/>
-        </w:rPr>
-        <w:t xml:space="preserve">As tecnologias digitais estão cada vez mais presentes no cotidiano escolar. Conectividade, computadores e plataformas educacionais, antes restritos aos laboratórios de informática, passaram a fazer parte do trabalho pedagógico e ampliaram as exigências dirigidas às políticas públicas. Essa presença varia muito de uma escola para outra, porque depende da infraestrutura, da conexão, da formação dos profissionais e do território em que cada escola está. Ainda no fim da década de 1990, Valente (1999, p. 83) advertia que “implantar computadores nas escolas sem o devido preparo de professores e da comunidade escolar não trará os benefícios que esperamos”. A advertência continua atual ao lembrar que a chegada do equipamento, por si, não garante seu uso pedagógico. Na escola investigada, a situação é anterior a essa discussão, já que as salas dos anos iniciais registradas na pesquisa não dispunham de nenhum dispositivo digital. Esta tese procura compreender o que acontece no espaço que se abre entre a educação digital garantida pela lei e as condições concretas de que a escola dispõe.</w:t>
+        <w:rPr/>
+        <w:t xml:space="preserve">As tecnologias digitais estão cada vez mais presentes no cotidiano escolar. Conectividade, computadores e plataformas educacionais, antes restritos aos laboratórios de informática, passaram a fazer parte do trabalho pedagógico e ampliaram as exigências dirigidas às políticas públicas. Essa presença varia muito de uma escola para outra, porque depende da infraestrutura, da conexão, da formação dos profissionais e do território em que cada escola está. Ainda no fim da década de 1990, Valente (1999, p. 83) advertia que “implantar computadores nas escolas sem o devido preparo de professores e da comunidade escolar não trará os benefícios que esperamos”. A advertência continua atual ao lembrar que a chegada do equipamento, por si, não garante seu uso pedagógico. Na escola investigada, a situação é anterior a essa discussão, já que as salas dos anos iniciais registradas na pesquisa não dispunham de nenhum dispositivo digital. É no espaço que se abre entre a educação digital garantida pela lei e as condições concretas de que a escola dispõe que esta tese se situa.</w:t>
       </w:r>
     </w:p>
     <w:p>
@@ -103,11 +100,8 @@
         <w:jc w:val="both"/>
       </w:pPr>
       <w:r>
-        <w:rPr>
-          <w:b w:val="0"/>
-          <w:i w:val="0"/>
-        </w:rPr>
-        <w:t>Esse reconhecimento varia de pessoa para pessoa, porque cultura digital e direitos digitais são expressões que cada um preenche à sua maneira. Quando uma professora afirma trabalhar cultura digital com a turma, ou quando uma gestora garante cuidar dos direitos digitais das crianças, cada uma fala a partir de um entendimento próprio, que precisa ser interpretado. Stuart Hall (2006) oferece uma chave para ler essas falas. Ao discutir as culturas nacionais, o autor afirma que “uma cultura nacional é um discurso – um modo de construir sentidos que influencia e organiza tanto nossas ações quanto a concepção que temos de nós mesmos” (HALL, 2006, p. 50). Hall não trata de políticas educacionais, e a aproximação é nossa; da passagem retiramos a ideia de que os sentidos organizam a ação. Entendemos por sentido, assim, a significação que cada profissional produz sobre a política, inseparável de sua trajetória, de suas condições de trabalho e do lugar institucional de onde fala. Por essa razão, as narrativas dos profissionais ocupam o centro da produção de dados.</w:t>
+        <w:rPr/>
+        <w:t xml:space="preserve">Esse reconhecimento varia de pessoa para pessoa, porque cultura digital e direitos digitais são expressões que cada um preenche à sua maneira. Quando uma professora afirma trabalhar cultura digital com a turma, ou quando uma gestora garante cuidar dos direitos digitais das crianças, cada uma fala a partir de um entendimento próprio, que precisa ser interpretado. Stuart Hall (2006) oferece uma chave para ler essas falas. Ao discutir as culturas nacionais, o autor afirma que “uma cultura nacional é um discurso – um modo de construir sentidos que influencia e organiza tanto nossas ações quanto a concepção que temos de nós mesmos” (HALL, 2006, p. 50-51). Hall não trata de políticas educacionais, e a aproximação é nossa; da passagem retiramos a ideia de que os sentidos organizam a ação. Entendemos por sentido, assim, a significação que cada profissional produz sobre a política, inseparável de sua trajetória, de suas condições de trabalho e do lugar institucional de onde fala, e é por isso que as narrativas dos profissionais ocupam o centro da produção de dados.</w:t>
       </w:r>
     </w:p>
     <w:p>
@@ -131,11 +125,8 @@
         <w:jc w:val="both"/>
       </w:pPr>
       <w:r>
-        <w:rPr>
-          <w:b w:val="0"/>
-          <w:i w:val="0"/>
-        </w:rPr>
-        <w:t xml:space="preserve">Delimitada essa escala, é preciso explicitar o percurso de uma lei até a escola. Entre o texto oficial e o cotidiano escolar, as orientações encontram pessoas, limites institucionais, recursos desiguais e dinâmicas do território, e todos esses elementos interferem no modo como a norma ganha forma. Tomamos, então, a política como processo, com base na Abordagem do Ciclo de Políticas (ACP), formulada por Bowe, Ball e Gold (1992). Ao descreverem o contexto da prática, os autores afirmam: “a política não é simplesmente recebida e implementada nesta arena, ao contrário, ela está sujeita à interpretação e então é ‘recriada’” (BOWE; BALL; GOLD, 1992, p. 22, tradução nossa). Mainardes (2006, p. 52), ao sistematizar a ACP para a pesquisa educacional brasileira, explicita a consequência desse movimento: “o contexto da prática é onde a política está sujeita à interpretação e recriação e onde a política produz efeitos e conseqüências que podem representar mudanças e transformações significativas na política original”. Para esta pesquisa, a formulação tem um sentido preciso. Ao chegar à Escola Municipal Domitila Castelo da Silva, o eixo Educação Digital Escolar será lido, adaptado e, possivelmente, transformado por quem trabalha nela, e a análise precisa acompanhar essas transformações sem tratá-las, de antemão, como desvio.</w:t>
+        <w:rPr/>
+        <w:t xml:space="preserve">Entre o texto oficial e o cotidiano escolar, as orientações encontram pessoas, limites institucionais, recursos desiguais e dinâmicas do território, e todos esses elementos interferem no modo como a norma ganha forma. Por isso tomamos a política como processo, com base na Abordagem do Ciclo de Políticas (ACP), formulada por Bowe, Ball e Gold (1992). Ao descreverem o contexto da prática, os autores afirmam: “a política não é simplesmente recebida e implementada nesta arena, ao contrário, ela está sujeita à interpretação e então é ‘recriada’” (BOWE; BALL; GOLD, 1992, p. 22, tradução nossa). Mainardes (2006, p. 52), ao sistematizar a ACP para a pesquisa educacional brasileira, explicita a consequência desse movimento: “o contexto da prática é onde a política está sujeita à interpretação e recriação e onde a política produz efeitos e conseqüências que podem representar mudanças e transformações significativas na política original”. Ao chegar à Escola Municipal Domitila Castelo da Silva, o eixo Educação Digital Escolar será lido, adaptado e, possivelmente, transformado por quem trabalha nela, e a análise precisa acompanhar essas transformações sem tratá-las, de antemão, como desvio.</w:t>
       </w:r>
     </w:p>
     <w:p>
@@ -257,11 +248,8 @@
         <w:jc w:val="both"/>
       </w:pPr>
       <w:r>
-        <w:rPr>
-          <w:b w:val="0"/>
-          <w:i w:val="0"/>
-        </w:rPr>
-        <w:t>O objeto nos coloca diante de uma questão presente em toda a tese, a de saber o que acontece com uma política quando os direitos que ela institui não vêm acompanhados dos meios necessários para se realizarem. A seção 1.2 mostra como o próprio desenho da PNED produz essa situação, e a seção 1.5 apresenta a tese de partida com que a enfrentamos.</w:t>
+        <w:rPr/>
+        <w:t xml:space="preserve">O objeto nos coloca diante de uma questão que atravessa a tese, a de saber o que acontece com uma política quando os direitos que ela institui não vêm acompanhados dos meios necessários para se realizarem.</w:t>
       </w:r>
     </w:p>
     <w:p>
@@ -321,11 +309,8 @@
         <w:jc w:val="both"/>
       </w:pPr>
       <w:r>
-        <w:rPr>
-          <w:b w:val="0"/>
-          <w:i w:val="0"/>
-        </w:rPr>
-        <w:t>Duas noções ajudam a compreender por que a mesma política ganha formas diferentes em cada escola. A primeira é a de culturas profissionais. Ball, Maguire e Braun (2016) incluem os valores, os compromissos e as experiências dos professores entre as dimensões do contexto que interferem na atuação das políticas, e Hargreaves (2005) dá conteúdo a essa dimensão ao afirmar que “as culturas do ensino compreendem crenças, valores, hábitos e formas de fazer as coisas assumidas pelas comunidades de professores que têm de enfrentar exigências e limitações semelhantes ao longo de muitos anos” (HARGREAVES, 2005, p. 189, tradução nossa). O autor distingue o conteúdo dessas culturas, feito de pressupostos, valores, atitudes e crenças compartilhados, de sua forma, que corresponde aos padrões de relação entre os profissionais, como o individualismo, a colaboração, a colegialidade artificial e a balcanização (HARGREAVES, 2005, p. 189-191). Aquilo que uma equipe considera um bom trabalho, o que costuma acolher e o que costuma deixar de lado filtram o que a política pede. A segunda noção é a de performatividade, com a qual Ball (2004) descreve a cultura de metas, comparações e prestação de contas que passa a orientar o trabalho e a própria identidade dos profissionais da educação. Interessa-nos saber se a educação digital chega à escola de Pipa também como exigência de registro, evidência e resultado, e o que os profissionais fazem com essa exigência. Com essas noções, tratamos os profissionais da educação como fazedores de política, capazes de atribuir sentido ao que a lei propõe e de responder ao que encontram.</w:t>
+        <w:rPr/>
+        <w:t xml:space="preserve">A mesma política ganha formas diferentes em cada escola, e duas noções ajudam a compreender por quê. Ball, Maguire e Braun (2016, p. 38) incluem as culturas profissionais entre as dimensões do contexto que interferem na atuação das políticas, e Hargreaves (2005) dá conteúdo a essa dimensão ao afirmar que “as culturas do ensino compreendem crenças, valores, hábitos e formas de fazer as coisas assumidas pelas comunidades de professores que têm de enfrentar exigências e limitações semelhantes ao longo de muitos anos” (HARGREAVES, 2005, p. 189, tradução nossa). O autor distingue o conteúdo dessas culturas, feito de pressupostos, valores, atitudes e crenças compartilhados, de sua forma, que corresponde aos padrões de relação entre os profissionais, como o individualismo, a colaboração, a colegialidade artificial e a balcanização (HARGREAVES, 2005, p. 189-191). Aquilo que uma equipe considera um bom trabalho, o que costuma acolher e o que costuma deixar de lado filtram o que a política pede. Com a noção de performatividade, Ball (2004) descreve a cultura de metas, comparações e prestação de contas que passa a orientar o trabalho e a própria identidade dos profissionais da educação, e em outro texto a define como “um regime de prestação de contas que emprega julgamentos, comparações e exposições como meios de controle, desgaste e mudança” (BALL, 2008, p. 49, tradução nossa). Interessa-nos saber se a educação digital chega à escola de Pipa também como exigência de registro, evidência e resultado, e o que os profissionais fazem com essa exigência. Com essas noções, tratamos os profissionais da educação como fazedores de política, capazes de atribuir sentido ao que a lei propõe e de responder ao que encontram.</w:t>
       </w:r>
     </w:p>
     <w:p>
@@ -335,11 +320,8 @@
         <w:jc w:val="both"/>
       </w:pPr>
       <w:r>
-        <w:rPr>
-          <w:b w:val="0"/>
-          <w:i w:val="0"/>
-        </w:rPr>
-        <w:t>Essas noções foram construídas, em boa parte, a partir de escolas inglesas e de sistemas com outras condições, e precisam ser lidas com cuidado num caso como o nosso. Numa escola pequena de Pipa, os profissionais conhecem cada criança e cada família e, com frequência, vivem no mesmo território. Deixar de fazer uma atividade, adaptá-la ou cumpri-la apenas no papel são decisões tomadas diante de pessoas que eles reencontram fora da escola. A expressão profissionais da educação, além disso, reúne posições diferentes. Ball, Maguire e Braun (2016, p. 75) observaram, nas escolas estudadas, que “os atores nas escolas são posicionados de forma diferente e assumem posições diversas em relação à política”. Na escola investigada, quem está na regência da turma, na coordenação ou na direção recebe a política de um lugar diferente, com margem de decisão, acesso a recursos e responsabilidades próprios. A professora em regência precisa encaixar conteúdos de cultura digital numa turma com o tempo, os recursos e as condições de que dispõe; a direção decide prioridades, como a contratação de uma conexão adequada ao uso pedagógico ou a escolha da demanda a ser encaminhada à Secretaria quando os recursos não bastam para todas; e a coordenação pedagógica negocia a entrada de novas exigências curriculares numa rotina já tomada por horários, demandas e prioridades. Ler a encenação a partir da posição de cada participante evita, ainda, cobrar de cada profissional o que somente o desenho da política poderia garantir.</w:t>
+        <w:rPr/>
+        <w:t xml:space="preserve">Essas noções foram construídas, em boa parte, a partir de escolas inglesas e de sistemas com outras condições, e precisam ser lidas com cuidado num caso como o nosso. Numa escola pequena de Pipa, os profissionais conhecem cada criança e cada família e, com frequência, vivem no mesmo território. Deixar de fazer uma atividade, adaptá-la ou cumpri-la apenas no papel são decisões tomadas diante de pessoas que eles reencontram fora da escola. A expressão profissionais da educação, além disso, reúne posições diferentes. Ball, Maguire e Braun (2016, p. 74-75) observaram, nas escolas estudadas, que “os atores nas escolas são posicionados de forma diferente e assumem posições diversas em relação à política”. Na escola investigada, quem está na regência da turma, na coordenação ou na direção recebe a política de um lugar diferente, com margem de decisão, acesso a recursos e responsabilidades próprios. A professora em regência precisa encaixar conteúdos de cultura digital numa turma com o tempo, os recursos e as condições de que dispõe; a direção decide prioridades, como a contratação de uma conexão adequada ao uso pedagógico ou a escolha da demanda a ser encaminhada à Secretaria quando os recursos não bastam para todas; e a coordenação pedagógica negocia a entrada de novas exigências curriculares numa rotina já tomada por horários, demandas e prioridades. Ler a encenação a partir da posição de cada participante evita, ainda, cobrar de cada profissional o que somente o desenho da política poderia garantir.</w:t>
       </w:r>
     </w:p>
     <w:p>
@@ -349,11 +331,8 @@
         <w:jc w:val="both"/>
       </w:pPr>
       <w:r>
-        <w:rPr>
-          <w:b w:val="0"/>
-          <w:i w:val="0"/>
-        </w:rPr>
-        <w:t>A delimitação do campo em Pipa acrescenta à pesquisa condições próprias do território. O distrito, que foi vila de pescadores, integra um município de pequeno porte e passou a viver, a partir dos anos 1990, um turismo intenso, com relações econômicas, sociais e culturais que ultrapassam os limites locais. Para compreendê-lo, recorremos a Milton Santos (1999), para quem “o território não é uma categoria de análise, a categoria de análise é o território usado” (SANTOS, 1999, p. 18). O território usado, explica o autor, deve ser visto “como um campo de forças, como o lugar do exercício, de dialéticas e contradições entre o vertical e o horizontal, entre o Estado e o mercado, entre o uso econômico e o uso social dos recursos” (SANTOS, 1999, p. 19). Em Pipa, essa contradição tem expressão concreta. O distrito onde pousadas, restaurantes e passeios se vendem pela internet é o mesmo de onde as crianças saem, pela manhã, para salas de aula com carteiras enfileiradas, alfabeto móvel feito à mão e nenhuma tela.</w:t>
+        <w:rPr/>
+        <w:t xml:space="preserve">A delimitação do campo em Pipa acrescenta à pesquisa condições próprias do território. O distrito integra um município de pequeno porte e, na década de 1970, era uma comunidade agrícola e pesqueira, sem energia elétrica, água encanada e boas vias de acesso, que passou a receber surfistas a partir de meados daquela década e, com a divulgação mais intensa iniciada nos anos 1990, se tornou destino turístico internacional (AIRES, 2012, p. 79-86). Para compreendê-lo, recorremos a Milton Santos, para quem “o território não é uma categoria de análise, a categoria de análise é o território usado” (SANTOS, 1999, p. 19). O território usado, explica o autor, deve ser visto “como um campo de forças, como o lugar do exercício, de dialéticas e contradições entre o vertical e o horizontal, entre o Estado e o mercado, entre o uso econômico e o uso social dos recursos” (SANTOS, 1999, p. 20). Em Pipa, essa contradição tem expressão concreta. O distrito onde pousadas, restaurantes e passeios se vendem pela internet é o mesmo de onde as crianças saem, pela manhã, para salas de aula com carteiras enfileiradas, alfabeto móvel feito à mão e nenhuma tela, situação que Santos (2006, p. 163) ajuda a nomear quando observa que, com a difusão do meio técnico-científico-informacional, “distinguem-se zonas servidas pelos meios de conhecimento e áreas desprovidas dessa vantagem”.</w:t>
       </w:r>
     </w:p>
     <w:p>
@@ -363,11 +342,8 @@
         <w:jc w:val="both"/>
       </w:pPr>
       <w:r>
-        <w:rPr>
-          <w:b w:val="0"/>
-          <w:i w:val="0"/>
-        </w:rPr>
-        <w:t>Doreen Massey (2008) acrescenta a essa leitura uma compreensão do lugar. Ao defini-lo, a autora escreve: “Trata-se, simplesmente, de um encontro de trajetórias” (MASSEY, 2008, p. 204). E explica: “o que é especial sobre o lugar é, precisamente, esse acabar juntos, o inevitável desafio de negociar um aqui-e-agora” (MASSEY, 2008, p. 203). Esse encontro acontece também dentro da escola. A expansão do turismo trouxe ao distrito trabalhadores de outras regiões, estrangeiros e novas formas de trabalho, e as crianças atendidas pela escola vêm de famílias de moradores antigos, de migrantes, de estrangeiros e de pessoas ligadas ao turismo, com condições diversas de acesso às tecnologias. Na mesma turma reúnem-se experiências digitais desiguais, e a negociação desse “aqui-e-agora” cabe, em grande parte, aos profissionais da educação. A PNED contempla populações vulneráveis, crianças e adolescentes e estudantes com deficiência (BRASIL, 2023, art. 1º; art. 3º, IV e V), sem prever, em sua formulação, as particularidades dessa diversidade territorial.</w:t>
+        <w:rPr/>
+        <w:t xml:space="preserve">Doreen Massey (2008) acrescenta a essa leitura uma compreensão do lugar. Ao defini-lo, a autora escreve: “Trata-se, simplesmente, de um encontro de trajetórias” (MASSEY, 2008, p. 204). E explica: “o que é especial sobre o lugar é, precisamente, esse acabar juntos, o inevitável desafio de negociar um aqui-e-agora” (MASSEY, 2008, p. 203). Esse encontro acontece também dentro da escola. Com o turismo, terras de nativos passaram a veranistas, surfistas e estrangeiros, e trabalhadores de municípios vizinhos chegaram ao distrito atraídos pelos serviços (AIRES, 2012, p. 79-86). As crianças atendidas pela escola vêm de famílias de moradores antigos, de migrantes, de estrangeiros e de pessoas ligadas ao turismo, com condições diversas de acesso às tecnologias. Na mesma turma reúnem-se experiências digitais desiguais, e a negociação desse “aqui-e-agora” cabe, em grande parte, aos profissionais da educação. A PNED contempla populações vulneráveis, crianças e adolescentes e estudantes com deficiência (BRASIL, 2023, art. 1º; art. 3º, IV e V), sem prever, em sua formulação, as particularidades dessa diversidade territorial. Massey ajuda, ainda, a evitar que a distância entre a escola e os circuitos turísticos seja lida como atraso, ao criticar a operação que “transforma a geografia em história, o espaço em tempo” (MASSEY, 2008, p. 24). Escola e polo turístico são contemporâneos, e o que os separa são relações que a análise precisará explicar.</w:t>
       </w:r>
     </w:p>
     <w:p>
@@ -470,11 +446,8 @@
         <w:jc w:val="both"/>
       </w:pPr>
       <w:r>
-        <w:rPr>
-          <w:b w:val="0"/>
-          <w:i w:val="0"/>
-        </w:rPr>
-        <w:t>Esse desenho tende a pesar mais em municípios de pequeno porte, como aquele em que a pesquisa se desenvolve. Seria possível tratar a situação como simples falha de gestão local, leitura que recusamos por retirar de cena o desenho da lei e invisibilizar o trabalho realizado cotidianamente pelos profissionais diante das lacunas da política. Ball (2011, p. 36) descreve esse deslocamento ao criticar pesquisas presas a “táticas de formuladores de políticas não reflexivas, ‘baseadas na culpabilização’, nas quais as políticas são sempre soluções e nunca parte do problema. O problema está ‘na’ escola ou ‘no’ professor, mas ‘nunca nas políticas’”. O autor esclarece, na mesma página: “Não estou pretendendo ‘desculpar a má prática’” (BALL, 2011, p. 36). Esta pesquisa assume a mesma cautela. Enfatizar o peso do desenho da política permite situar cada responsabilidade em sua escala, inclusive a da gestão local.</w:t>
+        <w:rPr/>
+        <w:t xml:space="preserve">Esse desenho tende a pesar mais em municípios de pequeno porte, como aquele em que a pesquisa se desenvolve. Tratar a situação como simples falha de gestão local retiraria de cena o desenho da lei e tornaria invisível o trabalho realizado cotidianamente pelos profissionais diante das lacunas da política. Ball (2011, p. 36) descreve esse deslocamento ao criticar pesquisas presas a “táticas de formuladores de políticas não reflexivas, ‘baseadas na culpabilização’, nas quais as políticas são sempre soluções e nunca parte do problema. O problema está ‘na’ escola ou ‘no’ professor, mas ‘nunca nas políticas’”. O autor esclarece, na mesma página: “Não estou pretendendo ‘desculpar a má prática’” (BALL, 2011, p. 36). Assumimos a mesma cautela, e enfatizar o peso do desenho da política permite situar cada responsabilidade em sua escala, inclusive a da gestão local.</w:t>
       </w:r>
     </w:p>
     <w:p>
@@ -568,11 +541,8 @@
         <w:jc w:val="both"/>
       </w:pPr>
       <w:r>
-        <w:rPr>
-          <w:b w:val="0"/>
-          <w:i w:val="0"/>
-        </w:rPr>
-        <w:t>O desenho da lei, a capacidade da rede, o tempo de trabalho, as desigualdades do território e a lacuna da literatura convergem, assim, para o trabalho de mediação realizado pelos profissionais em suas diferentes posições, feito de interpretações, traduções, escolhas e limites. É nesse trabalho que a análise se concentra.</w:t>
+        <w:rPr/>
+        <w:t xml:space="preserve">O desenho da lei, a capacidade da rede, o tempo de trabalho, as desigualdades do território e a lacuna da literatura convergem, assim, para o trabalho de mediação realizado pelos profissionais em suas diferentes posições, feito de interpretações, traduções, escolhas e limites, no qual a análise se concentra.</w:t>
       </w:r>
     </w:p>
     <w:p>
@@ -604,11 +574,8 @@
         <w:jc w:val="both"/>
       </w:pPr>
       <w:r>
-        <w:rPr>
-          <w:b w:val="0"/>
-          <w:i w:val="0"/>
-        </w:rPr>
-        <w:t>Formulamos a questão de modo a manter aberto o seu resultado. Não sabemos de antemão se a PNED será acolhida, adaptada, posta de lado ou contestada pelos profissionais da escola, e pressupor qualquer uma dessas respostas comprometeria a investigação antes de ela começar. O que buscamos conhecer são as maneiras de agir diante da política e as condições que tornam algumas delas possíveis e outras pouco prováveis. A resistência, nomeada no título, entra nesse quadro como possibilidade de interesse, que poderá aparecer ou não nos dados e que, se aparecer, será lida em relação às condições em que se constitui, às demandas a que responde e aos efeitos que produz no cotidiano escolar. A questão desdobra-se no objetivo geral e em quatro objetivos específicos.</w:t>
+        <w:rPr/>
+        <w:t xml:space="preserve">Formulamos a questão de modo a manter aberto o seu resultado. Ainda não sabemos se a PNED será acolhida, adaptada, posta de lado ou contestada pelos profissionais da escola, e pressupor qualquer uma dessas respostas comprometeria a investigação antes de ela começar. Buscamos conhecer as maneiras de agir diante da política e as condições que tornam algumas delas possíveis e outras pouco prováveis. A teoria da atuação sustenta essa abertura, já que as políticas “raramente ditam ou determinam a prática, mas algumas mais do que outras estreitam a gama de respostas criativas” (BALL; MAGUIRE; BRAUN, 2016, p. 14). A resistência, nomeada no título, entra nesse quadro como possibilidade de interesse, que poderá aparecer ou não nos dados e que, se aparecer, será lida em relação às condições em que se constitui, às demandas a que responde e aos efeitos que produz no cotidiano escolar.</w:t>
       </w:r>
     </w:p>
     <w:p>
@@ -688,11 +655,8 @@
         <w:jc w:val="both"/>
       </w:pPr>
       <w:r>
-        <w:rPr>
-          <w:b w:val="0"/>
-          <w:i w:val="0"/>
-        </w:rPr>
-        <w:t>Os quatro objetivos seguem o caminho que a própria política percorre até chegar às crianças. O primeiro se detém nos sujeitos e no modo como leem a política a partir do que já sabem, acreditam e praticam. O segundo leva essa leitura para as condições em que ela acontece, dentro da escola e no território, e é nele que Pipa entra como dimensão do contexto da política. O terceiro reúne os dois anteriores para perguntar o que os profissionais efetivamente fazem com a PNED, sem estabelecer previamente qual forma de atuação deve prevalecer. O quarto acompanha a política até as crianças, a quem ela se dirige e em nome de quem se justifica, e examina como as formas de encenação identificadas ampliam, limitam ou reorganizam as possibilidades de provisão, proteção e participação. As crianças não participam da produção de dados, e o que se poderá dizer sobre elas virá das condições documentadas e das compreensões dos profissionais.</w:t>
+        <w:rPr/>
+        <w:t xml:space="preserve">Os quatro objetivos acompanham o caminho que a política percorre até chegar às crianças. O primeiro se detém nos sujeitos e no modo como leem a política a partir do que já sabem, acreditam e praticam. O segundo leva essa leitura para as condições em que ela acontece, dentro da escola e no território, e é nele que Pipa entra como dimensão do contexto da política. O terceiro reúne os dois anteriores para perguntar o que os profissionais efetivamente fazem com a PNED, sem estabelecer previamente qual forma de atuação deve prevalecer. O quarto acompanha a política até as crianças, a quem ela se dirige e em nome de quem se justifica, e examina como as formas de encenação identificadas ampliam, limitam ou reorganizam as possibilidades de provisão, proteção e participação (ONU, 2021). As crianças não participam da produção de dados, e o que se poderá dizer sobre elas virá das condições documentadas e das compreensões dos profissionais.</w:t>
       </w:r>
     </w:p>
     <w:p>
@@ -710,11 +674,8 @@
         <w:jc w:val="both"/>
       </w:pPr>
       <w:r>
-        <w:rPr>
-          <w:b w:val="0"/>
-          <w:i w:val="0"/>
-        </w:rPr>
-        <w:t>A ACP oferece a matriz para compreender a trajetória da PNED, dos contextos de influência e de produção do texto ao contexto da prática, que ocupa posição privilegiada na pesquisa (BOWE; BALL; GOLD, 1992; MAINARDES, 2006). A teoria da atuação de Ball, Maguire e Braun (2016) é o principal dispositivo analítico. Os autores propõem quatro dimensões do contexto que orientarão a análise: a situacional, que reúne a história da escola, sua localização e a composição de seu público; a das culturas profissionais; a material, que compreende infraestrutura, espaços, equipamentos, conectividade e recursos; e a externa, que abrange as pressões e os apoios vindos de fora, como as orientações da rede e as relações com outras instâncias de governo. A performatividade (BALL, 2004) e as fabricações, que Ball (2002) descreve como versões de uma instituição ou de uma prática produzidas para serem avaliadas, entram como lentes para examinar se a política chega acompanhada de exigências de registro e demonstração e como os profissionais respondem a elas. Todas essas noções funcionam como lentes de leitura, que orientam o olhar sobre os dados sem antecipar o que será encontrado.</w:t>
+        <w:rPr/>
+        <w:t xml:space="preserve">A ACP oferece a matriz para compreender a trajetória da PNED, dos contextos de influência e de produção do texto ao contexto da prática, que ocupa posição privilegiada na pesquisa (BOWE; BALL; GOLD, 1992; MAINARDES, 2006). A teoria da atuação de Ball, Maguire e Braun (2016) é o principal dispositivo analítico, e nela “a política é complexamente codificada em textos e artefatos e é decodificada (e recodificada) de forma igualmente complexa” (BALL; MAGUIRE; BRAUN, 2016, p. 14). Os autores propõem quatro dimensões do contexto (BALL; MAGUIRE; BRAUN, 2016, p. 38): a situacional, que reúne a história da escola, sua localização e a composição de seu público; a das culturas profissionais; a material, que compreende infraestrutura, espaços, equipamentos, conectividade e recursos; e a externa, que abrange as pressões e os apoios vindos de fora, como as orientações da rede e as relações com outras instâncias de governo. Para eles, “o contexto é uma força ‘ativa’, não é apenas um pano de fundo com os quais as escolas têm de operar” (BALL; MAGUIRE; BRAUN, 2016, p. 42). A performatividade (BALL, 2004, 2008) e as fabricações, que Ball (2002) descreve como versões de uma instituição ou de uma prática produzidas para serem avaliadas, entram como lentes para examinar se a política chega acompanhada de exigências de registro e demonstração e como os profissionais respondem a elas. Essas noções orientam o olhar sobre os dados sem antecipar o que será encontrado.</w:t>
       </w:r>
     </w:p>
     <w:p>
@@ -724,39 +685,28 @@
         <w:jc w:val="both"/>
       </w:pPr>
       <w:r>
-        <w:rPr>
-          <w:b w:val="0"/>
-          <w:i w:val="0"/>
-        </w:rPr>
-        <w:t xml:space="preserve">Para ler o território, articulamos Santos e Massey. Em </w:t>
+        <w:rPr/>
+        <w:t xml:space="preserve">O território é lido com Santos e Massey. Em </w:t>
       </w:r>
       <w:r>
         <w:rPr>
-          <w:b w:val="0"/>
           <w:i/>
         </w:rPr>
-        <w:t>A natureza do espaço</w:t>
+        <w:t xml:space="preserve">A natureza do espaço</w:t>
+      </w:r>
+      <w:r>
+        <w:rPr/>
+        <w:t xml:space="preserve">, Santos (2006, p. 12) compreende o espaço como conjunto indissociável de sistemas de objetos e de sistemas de ações e observa que “os sistemas de objetos condicionam a forma como se dão as ações” (SANTOS, 2006, p. 39). Os lugares guardam formas herdadas de outros períodos, que o autor chama de rugosidades, “o que fica do passado como forma, espaço construído, paisagem” (SANTOS, 2006, p. 92). Em </w:t>
       </w:r>
       <w:r>
         <w:rPr>
-          <w:b w:val="0"/>
-          <w:i w:val="0"/>
+          <w:i/>
         </w:rPr>
-        <w:t xml:space="preserve">, Santos (2006) compreende o espaço como conjunto indissociável de sistemas de objetos e de sistemas de ações e mostra que os lugares guardam formas herdadas de outros períodos, que ele chama de rugosidades. Em </w:t>
+        <w:t xml:space="preserve">Espaço e método</w:t>
       </w:r>
       <w:r>
-        <w:rPr>
-          <w:b w:val="0"/>
-          <w:i/>
-        </w:rPr>
-        <w:t>Espaço e método</w:t>
-      </w:r>
-      <w:r>
-        <w:rPr>
-          <w:b w:val="0"/>
-          <w:i w:val="0"/>
-        </w:rPr>
-        <w:t>, o autor lembra que “as rugosidades – formas remanescentes dos períodos anteriores – devem ser levadas em conta quando uma sociedade procura impor novas funções” (SANTOS, 2012, p. 75). Massey (2008), por sua vez, permite ler Pipa como lugar de encontro de trajetórias diversas, que chegam à escola na forma das famílias e das crianças que ela atende.</w:t>
+        <w:rPr/>
+        <w:t xml:space="preserve">, lembra que “as rugosidades – formas remanescentes dos períodos anteriores – devem ser levadas em conta quando uma sociedade procura impor novas funções” (SANTOS, 2012, p. 75). Massey, por sua vez, compreende o espaço “como a esfera da possibilidade da existência da multiplicidade, no sentido da pluralidade contemporânea, como a esfera na qual distintas trajetórias coexistem” (MASSEY, 2008, p. 29), o que permite ler Pipa como lugar de encontro de trajetórias que chegam à escola na forma das famílias e das crianças que ela atende.</w:t>
       </w:r>
     </w:p>
     <w:p>
@@ -766,11 +716,8 @@
         <w:jc w:val="both"/>
       </w:pPr>
       <w:r>
-        <w:rPr>
-          <w:b w:val="0"/>
-          <w:i w:val="0"/>
-        </w:rPr>
-        <w:t>Para responder à questão, adotamos abordagem qualitativa, de natureza interpretativa (MINAYO, 2009), e organizamos a investigação como estudo de caso único. Yin (2001, p. 32) define o estudo de caso como “uma investigação empírica que investiga um fenômeno contemporâneo dentro de seu contexto da vida real, especialmente quando os limites entre o fenômeno e o contexto não estão claramente definidos”. É a situação desta pesquisa, na qual infraestrutura, formação, cultura escolar e desigualdades do território condicionam a política e fazem parte dela ao mesmo tempo. O caso não pretende representar outras escolas; seu propósito é compreender a fundo uma realidade singular.</w:t>
+        <w:rPr/>
+        <w:t xml:space="preserve">Para responder à questão, adotamos abordagem qualitativa, de natureza interpretativa (MINAYO, 2009), e organizamos a investigação como estudo de caso único. Yin (2001, p. 32) define o estudo de caso como “uma investigação empírica que investiga um fenômeno contemporâneo dentro de seu contexto da vida real, especialmente quando os limites entre o fenômeno e o contexto não estão claramente definidos”. É a situação desta pesquisa, na qual infraestrutura, formação, cultura escolar e desigualdades do território condicionam a política e fazem parte dela ao mesmo tempo. O caso interessa pelo que permite compreender a fundo de uma realidade singular, sem pretensão de representar outras escolas.</w:t>
       </w:r>
     </w:p>
     <w:p>
@@ -794,11 +741,8 @@
         <w:jc w:val="both"/>
       </w:pPr>
       <w:r>
-        <w:rPr>
-          <w:b w:val="0"/>
-          <w:i w:val="0"/>
-        </w:rPr>
-        <w:t>Os dados serão construídos em cinco movimentos. O primeiro é a análise documental da Lei nº 14.533/2023, da Resolução CNE/CEB nº 2/2025, dos documentos curriculares, dos documentos da Secretaria Municipal de Educação e dos registros da escola, entre eles o Projeto Político-Pedagógico (PPP), os planos de aula, as atas e os registros de formação. O segundo é o registro iconográfico, com 38 imagens reunidas a partir da escola e do acervo do Museu Digital de Pipa, lidas com a noção de rugosidade e com a leitura do lugar proposta por Massey. O terceiro é um questionário de perfil e percepções, com função descritiva. O quarto são entrevistas individuais semiestruturadas, com os profissionais da escola e com o técnico da Secretaria, nas quais as noções de resistência, performatividade e fabricação não serão apresentadas nominalmente, para que os participantes descrevam suas experiências nos próprios termos. O quinto reúne as fontes pela análise temática reflexiva (BRAUN; CLARKE, 2006, 2019), com triangulação entre documentos, imagens, questionário e entrevistas, e se encerra com a devolutiva dos resultados à escola e à Secretaria. Esta pesquisa não observa aulas, e as práticas chegam à análise pelas narrativas dos participantes, enquanto as condições materiais chegam pelos documentos e pelo registro iconográfico. O registro iconográfico e a consulta ao acervo histórico já foram realizados e sustentam o Capítulo 6; os demais movimentos ocorrerão após a aprovação do Comitê de Ética em Pesquisa.</w:t>
+        <w:rPr/>
+        <w:t xml:space="preserve">Os dados serão construídos em cinco movimentos. O primeiro é a análise documental da Lei nº 14.533/2023, da Resolução CNE/CEB nº 2/2025, dos documentos curriculares, dos documentos da Secretaria Municipal de Educação e dos registros da escola, entre eles o Projeto Político-Pedagógico (PPP), os planos de aula, as atas e os registros de formação. O segundo é o registro iconográfico, com 38 imagens reunidas a partir da escola e do acervo do Museu Digital de Pipa, lidas com a noção de rugosidade e com a leitura do lugar proposta por Massey. O terceiro é um questionário de perfil e percepções, com função descritiva. O quarto são entrevistas individuais semiestruturadas, com os profissionais da escola e com o técnico da Secretaria, nas quais as noções de resistência, performatividade e fabricação não serão apresentadas nominalmente, para que os participantes descrevam suas experiências nos próprios termos. O quinto reúne as fontes pela análise temática reflexiva (BRAUN; CLARKE, 2006, 2019), com triangulação entre documentos, imagens, questionário e entrevistas, e se encerra com a devolutiva dos resultados à escola e à Secretaria. A pesquisa não observa aulas, e as práticas chegam à análise pelas narrativas dos participantes, enquanto as condições materiais chegam pelos documentos e pelo registro iconográfico. Ball, Maguire e Braun (2016, p. 49) adotaram a mesma delimitação no estudo que deu origem à teoria da atuação: “a prática de sala de aula não era foco do estudo [...] nós temos de confiar nos relatos dos professores nessas questões”. O registro iconográfico e a consulta ao acervo histórico já foram realizados e sustentam o Capítulo 6. Os demais movimentos dependem da aprovação, pelo Comitê de Ética em Pesquisa, da emenda ao protocolo já aprovado.</w:t>
       </w:r>
     </w:p>
     <w:p>
@@ -944,11 +888,18 @@
         <w:jc w:val="both"/>
       </w:pPr>
       <w:r>
+        <w:rPr/>
+        <w:t xml:space="preserve">A palavra “resistências” está no título da tese por escolha deliberada, que pede um cuidado correspondente. A resistência será tratada como forma de atuação possível, reconhecível quando os sujeitos recusarem, desviarem, adiarem, limitarem, reordenarem ou ressignificarem determinadas demandas e quando os dados sustentarem essa leitura. Uma prática distante do que a norma prescreve pode corresponder a uma acomodação, à falta de condições, à prioridade dada a outra demanda, a uma interpretação diferente do texto, a uma omissão, a uma adaptação ou a uma negociação, e a distinção entre essas possibilidades será construída na análise. Foucault dá a essa abertura um estatuto teórico. Ball, Maguire e Braun recorrem a ele ao tratar a política como “uma certa economia de discursos da verdade” (FOUCAULT, 1980, p. 93 apud BALL; MAGUIRE; BRAUN, 2016, p. 21), e em </w:t>
+      </w:r>
+      <w:r>
         <w:rPr>
-          <w:b w:val="0"/>
-          <w:i w:val="0"/>
+          <w:i/>
         </w:rPr>
-        <w:t>A palavra “resistências” está no título da tese por uma escolha deliberada, que pede um cuidado correspondente. A resistência será tratada como uma forma de atuação possível, reconhecível quando os sujeitos recusarem, desviarem, adiarem, limitarem, reordenarem ou ressignificarem determinadas demandas e quando os dados sustentarem essa leitura. Uma prática distante do que a norma prescreve pode corresponder a uma acomodação, à falta de condições, à prioridade dada a outra demanda, a uma interpretação diferente do texto, a uma omissão, a uma adaptação ou a uma negociação, e a distinção entre essas possibilidades será construída na análise. Essa abertura mantém a resistência como problema relevante para a tese sem transformá-la em conclusão antecipada.</w:t>
+        <w:t xml:space="preserve">Vigiar e punir</w:t>
+      </w:r>
+      <w:r>
+        <w:rPr/>
+        <w:t xml:space="preserve"> o autor mostra que as relações de poder “não são unívocas; definem inúmeros pontos de luta, focos de instabilidade comportando cada um seus riscos de conflito, de lutas e de inversão pelo menos transitória da relação de forças” (FOUCAULT, 1999, p. 29). A resistência pertence, assim, às relações de poder que a política mobiliza na escola e pode aparecer sem ser pressuposta. Ball (2011, p. 46) adverte, por outro lado, contra os estudos em que os sujeitos “emergem, resistentes e românticos, heróis althusserianos lutando contra a opressão”, e a análise procurará descrever o que os profissionais fazem e as condições que tornam necessárias as suas escolhas, sem culpá-los nem celebrá-los.</w:t>
       </w:r>
     </w:p>
     <w:p>
@@ -958,53 +909,38 @@
         <w:jc w:val="both"/>
       </w:pPr>
       <w:r>
-        <w:rPr>
-          <w:b w:val="0"/>
-          <w:i w:val="0"/>
-        </w:rPr>
-        <w:t xml:space="preserve">A tese dialoga ainda com formulações próprias ligadas às condições documentadas nos Capítulos 5 e 6. A principal delas é habitar o digital, que designa, nesta pesquisa, as maneiras pelas quais as tecnologias digitais atravessam os espaços, as relações e as práticas cotidianas de um território, produzindo possibilidades desiguais de acesso, participação e apropriação. A expressão resulta de um percurso teórico. Em </w:t>
+        <w:rPr/>
+        <w:t xml:space="preserve">A tese propõe ainda formulações próprias, ligadas às condições documentadas nos Capítulos 5 e 6. A principal delas é habitar o digital, que designa, nesta pesquisa, as maneiras pelas quais as tecnologias digitais atravessam os espaços, as relações e as práticas cotidianas de um território, produzindo possibilidades desiguais de acesso, participação e apropriação. A expressão resulta de um percurso teórico. Em </w:t>
       </w:r>
       <w:r>
         <w:rPr>
-          <w:b w:val="0"/>
           <w:i/>
         </w:rPr>
-        <w:t>O habitar do ensinar e do aprender OnLIFE</w:t>
+        <w:t xml:space="preserve">O habitar do ensinar e do aprender OnLIFE</w:t>
+      </w:r>
+      <w:r>
+        <w:rPr/>
+        <w:t xml:space="preserve">, obra organizada por Schlemmer </w:t>
       </w:r>
       <w:r>
         <w:rPr>
-          <w:b w:val="0"/>
-          <w:i w:val="0"/>
+          <w:i/>
         </w:rPr>
-        <w:t xml:space="preserve">, organizado por Schlemmer </w:t>
+        <w:t xml:space="preserve">et al.</w:t>
+      </w:r>
+      <w:r>
+        <w:rPr/>
+        <w:t xml:space="preserve"> (2021), o capítulo de abertura lembra que habitar “tem o significado de estar presente” e que o habitar, “além de estar acompanhado do movimento, tem uma natureza relacional” (SCHLEMMER; BACKES; PALAGI, 2021, p. 15), e recorre a Di Felice para compreendê-lo “enquanto prática comunicativa” (SCHLEMMER; BACKES; PALAGI, 2021, p. 17). Em </w:t>
       </w:r>
       <w:r>
         <w:rPr>
-          <w:b w:val="0"/>
           <w:i/>
         </w:rPr>
-        <w:t>et al.</w:t>
+        <w:t xml:space="preserve">Paisagens pós-urbanas</w:t>
       </w:r>
       <w:r>
-        <w:rPr>
-          <w:b w:val="0"/>
-          <w:i w:val="0"/>
-        </w:rPr>
-        <w:t xml:space="preserve"> (2021), o habitar é tomado como experiência relacional, constituída pelas relações entre sujeitos, ambientes, tecnologias e redes. Di Felice (2009), em </w:t>
-      </w:r>
-      <w:r>
-        <w:rPr>
-          <w:b w:val="0"/>
-          <w:i/>
-        </w:rPr>
-        <w:t>Paisagens pós-urbanas</w:t>
-      </w:r>
-      <w:r>
-        <w:rPr>
-          <w:b w:val="0"/>
-          <w:i w:val="0"/>
-        </w:rPr>
-        <w:t>, retoma a tradição filosófica do habitar e mostra como as tecnologias de comunicação transformam a relação entre sujeito, meios e território, descrevendo, com as redes digitais, um habitar atópico. Somadas às leituras de Santos e de Massey, essas contribuições permitem nomear uma tensão específica de Pipa, a coexistência de elevada densidade tecnológica nos circuitos econômicos e turísticos do distrito com uma disponibilidade muito mais limitada de tecnologias nos espaços pedagógicos da escola. A segunda formulação é a de rugosidade tecnológica, que nomeia as estruturas deixadas por iniciativas anteriores à política vigente e ainda presentes na escola. O laboratório de informática, segundo informações preliminares montado pela Prefeitura em 2022, é um exemplo, pois a PNED atribui nova função a equipamentos de uma iniciativa anterior a ela. A terceira é a de vazio material, construída no Capítulo 5 para nomear o resultado do desenho da lei quando a rede não consegue mobilizar os meios. Essas formulações dizem respeito às condições do contexto e serão confrontadas com os dados, podendo ser aprofundadas, revistas ou tensionadas; as formas de atuação dizem respeito à ação dos profissionais e só as entrevistas poderão mostrá-las.</w:t>
+        <w:rPr/>
+        <w:t xml:space="preserve">, Di Felice (2009) mostra como as tecnologias comunicativas transformam a relação entre sujeito, meios e território. Ao tratar da imprensa, afirma que “a invenção da escrita artificial coincide, de fato, com o surgimento de uma espacialidade artificial que marcará sobremaneira a Renascença e inaugurará um novo modo de habitar” (DI FELICE, 2009, p. 102), e, com as redes digitais, descreve um habitar atópico, realizado por meio de interações com interfaces, em ecossistemas informativos nos quais sujeito e território se relacionam em rede (DI FELICE, 2009, p. 20). Somadas às leituras de Santos e de Massey, essas contribuições permitem nomear uma tensão específica de Pipa, a coexistência de elevada densidade tecnológica nos circuitos econômicos e turísticos do distrito com uma disponibilidade muito mais limitada de tecnologias nos espaços pedagógicos da escola, que Santos (1999, p. 20-21) ajuda a entender como “dissonância entre os usos econômicos e os usos sociais dos mesmos recursos”. A segunda formulação é a de rugosidade tecnológica, que nomeia as estruturas deixadas por iniciativas anteriores à política vigente e ainda presentes na escola. O laboratório de informática, segundo informações preliminares montado pela Prefeitura em 2022, é um exemplo, pois a PNED atribui nova função a equipamentos de uma iniciativa anterior a ela, num movimento que Santos descreve ao observar que a forma “freqüentemente permanece aguardando o próximo movimento dinâmico da sociedade, quando terá toda a probabilidade de ser chamada a cumprir uma nova função” (SANTOS, 2012, p. 74-75). A terceira é a de vazio material, construída no Capítulo 5 para nomear o resultado do desenho da lei quando a rede não consegue mobilizar os meios. Essas formulações dizem respeito às condições do contexto e serão confrontadas com os dados, podendo ser aprofundadas, revistas ou tensionadas; as formas de atuação dizem respeito à ação dos profissionais, e só as entrevistas poderão mostrá-las.</w:t>
       </w:r>
     </w:p>
     <w:p>
@@ -1014,11 +950,8 @@
         <w:jc w:val="both"/>
       </w:pPr>
       <w:r>
-        <w:rPr>
-          <w:b w:val="0"/>
-          <w:i w:val="0"/>
-        </w:rPr>
-        <w:t>O ineditismo da pesquisa tem três dimensões. A primeira é empírico-temporal, pois a investigação acompanha a chegada da PNED à escola no momento em que a exigência curricular se torna obrigatória e ocupa uma lacuna identificada pela RSL. A segunda é analítico-espacial, porque o território de Pipa entra na análise como dimensão constitutiva do contexto da prática, com o peso que Santos e Massey lhe atribuem. A terceira é teórico-conceitual. Ao articular a teoria da atuação, as culturas profissionais, a dimensão material da escola e a leitura do território, e ao propor a noção de habitar o digital, a tese trata a distância entre a norma e a sala de aula como parte de uma relação política entre texto, contexto e sujeitos, sem classificá-la de imediato como falha, incapacidade ou resistência. A pergunta que interessa, assim, diz respeito ao que acontece com a PNED quando encontra uma escola, seus profissionais, suas condições materiais e um território específico, e é nesse encontro que se torna possível perguntar quem consegue habitar o digital, em que condições e com quais possibilidades de participação.</w:t>
+        <w:rPr/>
+        <w:t xml:space="preserve">O ineditismo da pesquisa se mostra em três planos que se apoiam mutuamente. No plano empírico-temporal, a investigação acompanha a chegada da PNED à escola no momento em que a exigência curricular se torna obrigatória e ocupa uma lacuna identificada pela RSL, e Ball (2011, p. 38) lembra que a abordagem da trajetória “capta as formas pelas quais as políticas evoluem, se modificam e decaem ao longo do tempo e do espaço, assim como as suas incoerências”. No plano analítico-espacial, o território de Pipa entra na análise como dimensão constitutiva do contexto da prática, com o peso que Santos e Massey lhe atribuem. No plano teórico-conceitual, a tese articula a teoria da atuação, as culturas profissionais, a dimensão material da escola e a leitura do território, propõe a noção de habitar o digital e trata a distância entre a norma e a sala de aula como parte de uma relação política entre texto, contexto e sujeitos, sem classificá-la de imediato como falha, incapacidade ou resistência. É nesse encontro entre a PNED, uma escola, seus profissionais, suas condições materiais e um território específico que se torna possível perguntar quem consegue habitar o digital, em que condições e com quais possibilidades de participação.</w:t>
       </w:r>
     </w:p>
     <w:p>
@@ -1050,11 +983,8 @@
         <w:jc w:val="both"/>
       </w:pPr>
       <w:r>
-        <w:rPr>
-          <w:b w:val="0"/>
-          <w:i w:val="0"/>
-        </w:rPr>
-        <w:t>A tese está organizada em oito capítulos, articulados à questão norteadora, aos objetivos e à contribuição apresentados nesta introdução. O Capítulo 7 responde aos quatro objetivos específicos, e os Capítulos 5 e 6 constroem as bases para respondê-los. O Quadro 9, no Capítulo 4, detalha a correspondência entre objetivos, fontes e capítulos.</w:t>
+        <w:rPr/>
+        <w:t xml:space="preserve">A tese está organizada em oito capítulos, articulados à questão norteadora, aos objetivos e à contribuição apresentados nesta introdução. O Capítulo 7 responde aos quatro objetivos específicos, e os Capítulos 5 e 6 constroem as bases para respondê-los; o Quadro 9, no Capítulo 4, detalha a correspondência entre objetivos, fontes e capítulos.</w:t>
       </w:r>
     </w:p>
     <w:p>
@@ -1148,6 +1078,34 @@
           <w:b w:val="0"/>
           <w:i w:val="0"/>
         </w:rPr>
+        <w:t xml:space="preserve">AIRES, Jussara Danielle Martins. </w:t>
+      </w:r>
+      <w:r>
+        <w:rPr>
+          <w:b/>
+          <w:i w:val="0"/>
+        </w:rPr>
+        <w:t xml:space="preserve">Histórias e relatos sobre Pipa</w:t>
+      </w:r>
+      <w:r>
+        <w:rPr>
+          <w:b w:val="0"/>
+          <w:i w:val="0"/>
+        </w:rPr>
+        <w:t xml:space="preserve">: a praia internacional do Rio Grande do Norte. 2012. 114 f. Dissertação (Mestrado em Ciências Sociais) – Programa de Pós-Graduação em Ciências Sociais, Universidade Federal do Rio Grande do Norte, Natal, 2012.</w:t>
+      </w:r>
+    </w:p>
+    <w:p>
+      <w:pPr>
+        <w:spacing w:line="240" w:lineRule="auto" w:after="240" w:before="0"/>
+        <w:ind w:firstLine="0"/>
+        <w:jc w:val="left"/>
+      </w:pPr>
+      <w:r>
+        <w:rPr>
+          <w:b w:val="0"/>
+          <w:i w:val="0"/>
+        </w:rPr>
         <w:t xml:space="preserve">BALL, Stephen J. Reformar escolas/reformar professores e os terrores da performatividade. </w:t>
       </w:r>
       <w:r>
@@ -1204,6 +1162,34 @@
           <w:b w:val="0"/>
           <w:i w:val="0"/>
         </w:rPr>
+        <w:t xml:space="preserve">BALL, Stephen J. </w:t>
+      </w:r>
+      <w:r>
+        <w:rPr>
+          <w:b/>
+          <w:i w:val="0"/>
+        </w:rPr>
+        <w:t xml:space="preserve">The education debate</w:t>
+      </w:r>
+      <w:r>
+        <w:rPr>
+          <w:b w:val="0"/>
+          <w:i w:val="0"/>
+        </w:rPr>
+        <w:t xml:space="preserve">. Bristol: The Policy Press, 2008.</w:t>
+      </w:r>
+    </w:p>
+    <w:p>
+      <w:pPr>
+        <w:spacing w:line="240" w:lineRule="auto" w:after="240" w:before="0"/>
+        <w:ind w:firstLine="0"/>
+        <w:jc w:val="left"/>
+      </w:pPr>
+      <w:r>
+        <w:rPr>
+          <w:b w:val="0"/>
+          <w:i w:val="0"/>
+        </w:rPr>
         <w:t xml:space="preserve">BALL, Stephen J. Sociologia das políticas educacionais e pesquisa crítico-social: uma revisão pessoal das políticas educacionais e da pesquisa em política educacional. In: BALL, Stephen J.; MAINARDES, Jefferson (org.). </w:t>
       </w:r>
       <w:r>
@@ -1540,6 +1526,34 @@
           <w:b w:val="0"/>
           <w:i w:val="0"/>
         </w:rPr>
+        <w:t xml:space="preserve">FOUCAULT, Michel. </w:t>
+      </w:r>
+      <w:r>
+        <w:rPr>
+          <w:b/>
+          <w:i w:val="0"/>
+        </w:rPr>
+        <w:t xml:space="preserve">Vigiar e punir</w:t>
+      </w:r>
+      <w:r>
+        <w:rPr>
+          <w:b w:val="0"/>
+          <w:i w:val="0"/>
+        </w:rPr>
+        <w:t xml:space="preserve">: nascimento da prisão. Tradução de Raquel Ramalhete. 20. ed. Petrópolis: Vozes, 1999.</w:t>
+      </w:r>
+    </w:p>
+    <w:p>
+      <w:pPr>
+        <w:spacing w:line="240" w:lineRule="auto" w:after="240" w:before="0"/>
+        <w:ind w:firstLine="0"/>
+        <w:jc w:val="left"/>
+      </w:pPr>
+      <w:r>
+        <w:rPr>
+          <w:b w:val="0"/>
+          <w:i w:val="0"/>
+        </w:rPr>
         <w:t xml:space="preserve">FREIRE, Paulo. </w:t>
       </w:r>
       <w:r>
@@ -1694,7 +1708,7 @@
           <w:b w:val="0"/>
           <w:i w:val="0"/>
         </w:rPr>
-        <w:t>: uma nova política da espacialidade. Rio de Janeiro: Bertrand Brasil, 2008.</w:t>
+        <w:t xml:space="preserve">: uma nova política da espacialidade. Tradução de Hilda Pareto Maciel e Rogério Haesbaert. Rio de Janeiro: Bertrand Brasil, 2008.</w:t>
       </w:r>
     </w:p>
     <w:p>
@@ -1988,7 +2002,7 @@
           <w:b w:val="0"/>
           <w:i w:val="0"/>
         </w:rPr>
-        <w:t>: técnica e tempo, razão e emoção. 4. ed. São Paulo: Edusp, 2006.</w:t>
+        <w:t xml:space="preserve">: técnica e tempo, razão e emoção. 4. ed. 2. reimpr. São Paulo: Editora da Universidade de São Paulo, 2006.</w:t>
       </w:r>
     </w:p>
     <w:p>
@@ -2030,7 +2044,7 @@
           <w:b w:val="0"/>
           <w:i w:val="0"/>
         </w:rPr>
-        <w:t xml:space="preserve">SCHLEMMER, Eliane; BACKES, Luciana; BITTENCOURT, João Ricardo; PALAGI, Ana Maria (org.). </w:t>
+        <w:t xml:space="preserve">SCHLEMMER, Eliane; BACKES, Luciana; BITTENCOURT, João Ricardo; PALAGI, Ana Maria Marques (org.). </w:t>
       </w:r>
       <w:r>
         <w:rPr>
@@ -2045,6 +2059,34 @@
           <w:i w:val="0"/>
         </w:rPr>
         <w:t>: vivências na educação contemporânea. São Leopoldo: Casa Leiria, 2021.</w:t>
+      </w:r>
+    </w:p>
+    <w:p>
+      <w:pPr>
+        <w:spacing w:line="240" w:lineRule="auto" w:after="240" w:before="0"/>
+        <w:ind w:firstLine="0"/>
+        <w:jc w:val="left"/>
+      </w:pPr>
+      <w:r>
+        <w:rPr>
+          <w:b w:val="0"/>
+          <w:i w:val="0"/>
+        </w:rPr>
+        <w:t xml:space="preserve">SCHLEMMER, Eliane; BACKES, Luciana; PALAGI, Ana Maria Marques. O habitar do ensinar e do aprender OnLIFE: vivências na educação contemporânea. In: SCHLEMMER, Eliane; BACKES, Luciana; BITTENCOURT, João Ricardo; PALAGI, Ana Maria Marques (org.). </w:t>
+      </w:r>
+      <w:r>
+        <w:rPr>
+          <w:b/>
+          <w:i w:val="0"/>
+        </w:rPr>
+        <w:t xml:space="preserve">O habitar do ensinar e do aprender OnLIFE</w:t>
+      </w:r>
+      <w:r>
+        <w:rPr>
+          <w:b w:val="0"/>
+          <w:i w:val="0"/>
+        </w:rPr>
+        <w:t xml:space="preserve">: vivências na educação contemporânea. São Leopoldo: Casa Leiria, 2021. p. 15-34.</w:t>
       </w:r>
     </w:p>
     <w:p>

</xml_diff>

<commit_message>
Capítulo 6 com a história de Pipa em Aires (2012); páginas de Aires corrigidas no projeto e na Introdução; Santos 1999 citado literalmente
Co-Authored-By: Claude Opus 5.5 <noreply@anthropic.com>
Claude-Session: https://claude.ai/code/session_01HxStpW4pQoDfJdTDYr6zEC
</commit_message>
<xml_diff>
--- a/introducao_nova/1_INTRODUCAO_alinhada_ao_projeto.docx
+++ b/introducao_nova/1_INTRODUCAO_alinhada_ao_projeto.docx
@@ -332,7 +332,7 @@
       </w:pPr>
       <w:r>
         <w:rPr/>
-        <w:t xml:space="preserve">A delimitação do campo em Pipa acrescenta à pesquisa condições próprias do território. O distrito integra um município de pequeno porte e, na década de 1970, era uma comunidade agrícola e pesqueira, sem energia elétrica, água encanada e boas vias de acesso, que passou a receber surfistas a partir de meados daquela década e, com a divulgação mais intensa iniciada nos anos 1990, se tornou destino turístico internacional (AIRES, 2012, p. 79-86). Para compreendê-lo, recorremos a Milton Santos, para quem “o território não é uma categoria de análise, a categoria de análise é o território usado” (SANTOS, 1999, p. 19). O território usado, explica o autor, deve ser visto “como um campo de forças, como o lugar do exercício, de dialéticas e contradições entre o vertical e o horizontal, entre o Estado e o mercado, entre o uso econômico e o uso social dos recursos” (SANTOS, 1999, p. 20). Em Pipa, essa contradição tem expressão concreta. O distrito onde pousadas, restaurantes e passeios se vendem pela internet é o mesmo de onde as crianças saem, pela manhã, para salas de aula com carteiras enfileiradas, alfabeto móvel feito à mão e nenhuma tela, situação que Santos (2006, p. 163) ajuda a nomear quando observa que, com a difusão do meio técnico-científico-informacional, “distinguem-se zonas servidas pelos meios de conhecimento e áreas desprovidas dessa vantagem”.</w:t>
+        <w:t xml:space="preserve">A delimitação do campo em Pipa acrescenta à pesquisa condições próprias do território. O distrito integra um município de pequeno porte e, na década de 1970, era uma comunidade agrícola e pesqueira, sem energia elétrica, água encanada e boas vias de acesso, que passou a receber surfistas a partir de meados daquela década e, com a divulgação mais intensa iniciada nos anos 1990, se tornou destino turístico internacional (AIRES, 2012, p. 81-82). Para compreendê-lo, recorremos a Milton Santos, para quem “o território não é uma categoria de análise, a categoria de análise é o território usado” (SANTOS, 1999, p. 19). O território usado, explica o autor, deve ser visto “como um campo de forças, como o lugar do exercício, de dialéticas e contradições entre o vertical e o horizontal, entre o Estado e o mercado, entre o uso econômico e o uso social dos recursos” (SANTOS, 1999, p. 20). Em Pipa, essa contradição tem expressão concreta. O distrito onde pousadas, restaurantes e passeios se vendem pela internet é o mesmo de onde as crianças saem, pela manhã, para salas de aula com carteiras enfileiradas, alfabeto móvel feito à mão e nenhuma tela, situação que Santos (2006, p. 163) ajuda a nomear quando observa que, com a difusão do meio técnico-científico-informacional, “distinguem-se zonas servidas pelos meios de conhecimento e áreas desprovidas dessa vantagem”.</w:t>
       </w:r>
     </w:p>
     <w:p>
@@ -343,7 +343,7 @@
       </w:pPr>
       <w:r>
         <w:rPr/>
-        <w:t xml:space="preserve">Doreen Massey (2008) acrescenta a essa leitura uma compreensão do lugar. Ao defini-lo, a autora escreve: “Trata-se, simplesmente, de um encontro de trajetórias” (MASSEY, 2008, p. 204). E explica: “o que é especial sobre o lugar é, precisamente, esse acabar juntos, o inevitável desafio de negociar um aqui-e-agora” (MASSEY, 2008, p. 203). Esse encontro acontece também dentro da escola. Com o turismo, terras de nativos passaram a veranistas, surfistas e estrangeiros, e trabalhadores de municípios vizinhos chegaram ao distrito atraídos pelos serviços (AIRES, 2012, p. 79-86). As crianças atendidas pela escola vêm de famílias de moradores antigos, de migrantes, de estrangeiros e de pessoas ligadas ao turismo, com condições diversas de acesso às tecnologias. Na mesma turma reúnem-se experiências digitais desiguais, e a negociação desse “aqui-e-agora” cabe, em grande parte, aos profissionais da educação. A PNED contempla populações vulneráveis, crianças e adolescentes e estudantes com deficiência (BRASIL, 2023, art. 1º; art. 3º, IV e V), sem prever, em sua formulação, as particularidades dessa diversidade territorial. Massey ajuda, ainda, a evitar que a distância entre a escola e os circuitos turísticos seja lida como atraso, ao criticar a operação que “transforma a geografia em história, o espaço em tempo” (MASSEY, 2008, p. 24). Escola e polo turístico são contemporâneos, e o que os separa são relações que a análise precisará explicar.</w:t>
+        <w:t xml:space="preserve">Doreen Massey (2008) acrescenta a essa leitura uma compreensão do lugar. Ao defini-lo, a autora escreve: “Trata-se, simplesmente, de um encontro de trajetórias” (MASSEY, 2008, p. 204). E explica: “o que é especial sobre o lugar é, precisamente, esse acabar juntos, o inevitável desafio de negociar um aqui-e-agora” (MASSEY, 2008, p. 203). Esse encontro acontece também dentro da escola. Com o turismo, casas e terrenos de nativos foram vendidos, trocados ou alugados a veranistas, surfistas e estrangeiros (AIRES, 2012, p. 79-80, 84), e os relatos reunidos pela autora incluem trabalhadoras vindas de localidades vizinhas para os serviços ligados ao turismo (AIRES, 2012, p. 16, 87). As crianças atendidas pela escola vêm de famílias de moradores antigos, de migrantes, de estrangeiros e de pessoas ligadas ao turismo, com condições diversas de acesso às tecnologias. Na mesma turma reúnem-se experiências digitais desiguais, e a negociação desse “aqui-e-agora” cabe, em grande parte, aos profissionais da educação. A PNED contempla populações vulneráveis, crianças e adolescentes e estudantes com deficiência (BRASIL, 2023, art. 1º; art. 3º, IV e V), sem prever, em sua formulação, as particularidades dessa diversidade territorial. Massey ajuda, ainda, a evitar que a distância entre a escola e os circuitos turísticos seja lida como atraso, ao criticar a operação que “transforma a geografia em história, o espaço em tempo” (MASSEY, 2008, p. 24). Escola e polo turístico são contemporâneos, e o que os separa são relações que a análise precisará explicar.</w:t>
       </w:r>
     </w:p>
     <w:p>

</xml_diff>

<commit_message>
Capítulo 3: fundamentos teóricos (ACP, atuação, culturas profissionais, performatividade, Foucault, habitar o digital, plataformas e dados) e remissões atualizadas
Co-Authored-By: Claude Opus 5.5 <noreply@anthropic.com>
Claude-Session: https://claude.ai/code/session_01HxStpW4pQoDfJdTDYr6zEC
</commit_message>
<xml_diff>
--- a/introducao_nova/1_INTRODUCAO_alinhada_ao_projeto.docx
+++ b/introducao_nova/1_INTRODUCAO_alinhada_ao_projeto.docx
@@ -115,7 +115,7 @@
           <w:b w:val="0"/>
           <w:i w:val="0"/>
         </w:rPr>
-        <w:t>Essas narrativas respondem também a pressões externas e estruturais, o que nos obriga a delimitar o lugar de dois referenciais críticos nesta tese: Zuboff (2021), com sua denúncia do capitalismo de vigilância, e Morozov (2018), com seu alerta contra as saídas puramente técnicas para dilemas políticos. Os dois ajudam a desenhar o contexto em que surgiu a PNED, no qual o digital costuma ser apresentado como resposta pronta para os impasses do ensino, com forte sustentação de setores empresariais. Procurar o peso do capitalismo de vigilância nas falas dos profissionais de uma escola de um município de pequeno porte, porém, forçaria uma escala analítica que o material não comporta. Temas amplos como a plataformização do ensino e a governança de dados ajudam, por isso, a situar o nascimento da política e ficam, intencionalmente, fora do objeto empírico, reservados a pesquisas futuras.</w:t>
+        <w:t xml:space="preserve">Essas narrativas respondem também a pressões externas e estruturais, o que nos obriga a delimitar o lugar de dois referenciais críticos nesta tese: Zuboff (2021), com sua denúncia do capitalismo de vigilância, e Morozov (2018), com seu alerta contra as saídas puramente técnicas para dilemas políticos. Os dois ajudam a desenhar o contexto em que surgiu a PNED, no qual o digital costuma ser apresentado como resposta pronta para os impasses do ensino, com forte sustentação de setores empresariais. Procurar o peso do capitalismo de vigilância nas falas dos profissionais de uma escola de um município de pequeno porte, porém, forçaria uma escala analítica que o material não comporta. Temas amplos como a plataformização do ensino e a governança de dados ajudam, por isso, a situar o nascimento da política e são discutidos no Capítulo 3 como contexto teórico, intencionalmente fora do objeto empírico.</w:t>
       </w:r>
     </w:p>
     <w:p>
@@ -1012,7 +1012,7 @@
           <w:b w:val="0"/>
           <w:i w:val="0"/>
         </w:rPr>
-        <w:t>, 2022), que localiza a lacuna ocupada pela tese. No terceiro, “Nenhum chão sob os pés: cultura e cibercultura no tempo que não se fixa”, ainda em construção, desenvolvemos o alicerce conceitual da investigação: cultura, cibercultura e cultura digital; temporalidade, mediações e experiência; governança de dados, poder e subjetividades no digital; a noção de habitar o digital; e a relação entre educação digital, culturas profissionais, performatividade e direitos da criança no ambiente digital.</w:t>
+        <w:t xml:space="preserve">, 2022), que localiza a lacuna ocupada pela tese. No terceiro, “Como uma política se torna prática: atuação, culturas profissionais, poder e o habitar o digital”, apresentamos os fundamentos teóricos da investigação: a ACP, a teoria da atuação, as culturas profissionais, a performatividade e a fabricação, a leitura foucaultiana do poder e da resistência e a noção de habitar o digital, acompanhada de uma discussão sobre plataformas, dados e solucionismo ligada à proteção das crianças.</w:t>
       </w:r>
     </w:p>
     <w:p>
@@ -1764,7 +1764,7 @@
           <w:b w:val="0"/>
           <w:i w:val="0"/>
         </w:rPr>
-        <w:t>: a ascensão dos dados e a morte da política. São Paulo: Ubu Editora, 2018.</w:t>
+        <w:t xml:space="preserve">: a ascensão dos dados e a morte da política. Tradução de Claudio Marcondes. São Paulo: Ubu Editora, 2018.</w:t>
       </w:r>
     </w:p>
     <w:p>

</xml_diff>

<commit_message>
Reescreve a Introdução no desenho em funil, da Secretaria à escola
Objeto, questão e objetivos do projeto revisado; novo parágrafo sobre
o município (área, população, localidades, Sibaúma, plano da rede);
técnico da SME como fonte principal da dimensão externa; caso único
com unidades incorporadas; movimentos de coleta da rede à escola;
ineditismo e delimitações na escala municipal; capítulo 6 do município
à escola; novas referências.

Co-Authored-By: Claude Opus 5.5 <noreply@anthropic.com>
Claude-Session: https://claude.ai/code/session_01HxStpW4pQoDfJdTDYr6zEC
</commit_message>
<xml_diff>
--- a/introducao_nova/1_INTRODUCAO_alinhada_ao_projeto.docx
+++ b/introducao_nova/1_INTRODUCAO_alinhada_ao_projeto.docx
@@ -126,7 +126,7 @@
       </w:pPr>
       <w:r>
         <w:rPr/>
-        <w:t xml:space="preserve">Entre o texto oficial e o cotidiano escolar, as orientações encontram pessoas, limites institucionais, recursos desiguais e dinâmicas do território, e todos esses elementos interferem no modo como a norma ganha forma. Por isso tomamos a política como processo, com base na Abordagem do Ciclo de Políticas (ACP), formulada por Bowe, Ball e Gold (1992). Ao descreverem o contexto da prática, os autores afirmam: “a política não é simplesmente recebida e implementada nesta arena, ao contrário, ela está sujeita à interpretação e então é ‘recriada’” (BOWE; BALL; GOLD, 1992, p. 22, tradução nossa). Mainardes (2006, p. 52), ao sistematizar a ACP para a pesquisa educacional brasileira, explicita a consequência desse movimento: “o contexto da prática é onde a política está sujeita à interpretação e recriação e onde a política produz efeitos e conseqüências que podem representar mudanças e transformações significativas na política original”. Ao chegar à Escola Municipal Domitila Castelo da Silva, o eixo Educação Digital Escolar será lido, adaptado e, possivelmente, transformado por quem trabalha nela, e a análise precisa acompanhar essas transformações sem tratá-las, de antemão, como desvio.</w:t>
+        <w:t>Entre o texto oficial e o cotidiano escolar, as orientações encontram pessoas, limites institucionais, recursos desiguais e dinâmicas do território, e todos esses elementos interferem no modo como a norma ganha forma. Por isso tomamos a política como processo, com base na Abordagem do Ciclo de Políticas (ACP), formulada por Bowe, Ball e Gold (1992). Ao descreverem o contexto da prática, os autores afirmam: “a política não é simplesmente recebida e implementada nesta arena, ao contrário, ela está sujeita à interpretação e então é ‘recriada’” (BOWE; BALL; GOLD, 1992, p. 22, tradução nossa). Mainardes (2006, p. 52), ao sistematizar a ACP para a pesquisa educacional brasileira, explicita a consequência desse movimento: “o contexto da prática é onde a política está sujeita à interpretação e recriação e onde a política produz efeitos e conseqüências que podem representar mudanças e transformações significativas na política original”. Antes de chegar à Escola Municipal Domitila Castelo da Silva, o eixo Educação Digital Escolar passa pela Secretaria Municipal de Educação de Tibau do Sul, que o lê e o converte em planos, formações e orientações para a rede. Na escola, ele será lido outra vez, adaptado e, possivelmente, transformado por quem trabalha nela. A análise precisa acompanhar essas traduções sucessivas sem tratá-las, de antemão, como desvio.</w:t>
       </w:r>
     </w:p>
     <w:p>
@@ -140,7 +140,7 @@
           <w:b w:val="0"/>
           <w:i w:val="0"/>
         </w:rPr>
-        <w:t>Lima (2008), em texto retomado por Queiroz e Paiva (2014), chega a uma leitura próxima por outro caminho, ao tratar a escola como “uma esfera própria de mediação” entre o contexto social mais amplo, no qual inclui a economia, a sociedade, as políticas públicas e as estratégias educacionais, e “as interações de pequena escala” (LIMA, 2008, p. 86-87 apud QUEIROZ; PAIVA, 2014, p. 258). A escola aparece como o lugar onde as duas escalas se encontram e se ajustam, compreensão coerente com a escolha de tomar uma única escola como caso e de nela ouvir os profissionais.</w:t>
+        <w:t>Lima (2008), em texto retomado por Queiroz e Paiva (2014), chega a uma leitura próxima por outro caminho, ao tratar a escola como “uma esfera própria de mediação” entre o contexto social mais amplo, no qual inclui a economia, a sociedade, as políticas públicas e as estratégias educacionais, e “as interações de pequena escala” (LIMA, 2008, p. 86-87 apud QUEIROZ; PAIVA, 2014, p. 258). A escola aparece como o lugar onde as duas escalas se encontram e se ajustam. Numa rede municipal, há entre elas uma instância intermediária, a Secretaria de Educação, que recebe as orientações nacionais e as encaminha às unidades, e por isso a pesquisa parte dela antes de chegar à escola e de ouvir seus profissionais.</w:t>
       </w:r>
     </w:p>
     <w:p>
@@ -238,7 +238,7 @@
           <w:b w:val="0"/>
           <w:i w:val="0"/>
         </w:rPr>
-        <w:t xml:space="preserve">Com esse recorte, definimos o objeto desta pesquisa: a encenação da Política Nacional de Educação Digital, em seu eixo Educação Digital Escolar, pelos profissionais da educação que atuam nos anos iniciais do Ensino Fundamental, do 1º ao 5º ano, na Escola Municipal Domitila Castelo da Silva, em Pipa, distrito de Tibau do Sul, no litoral sul do Rio Grande do Norte. Chamamos de profissionais da educação as professoras e os professores do 1º ao 5º ano, a coordenação pedagógica, a direção e os demais profissionais ligados aos processos pedagógicos ou à educação digital. Interessam-nos os modos pelos quais a política é interpretada, traduzida e recontextualizada no contexto da prática, bem como o peso que têm nesse processo as culturas profissionais, as condições materiais e institucionais da escola e as especificidades socioespaciais do lugar onde ela está. O território, o funcionamento da escola e as condições de infraestrutura entram, assim, na análise como dimensões do contexto da prática, e as narrativas dos profissionais constituem o principal caminho para compreender como a política ganha forma no cotidiano escolar.</w:t>
+        <w:t>Com esse recorte, definimos o objeto desta pesquisa: a encenação da Política Nacional de Educação Digital, em seu eixo Educação Digital Escolar, no município de Tibau do Sul, no litoral sul do Rio Grande do Norte, acompanhada da Secretaria Municipal de Educação até a Escola Municipal Domitila Castelo da Silva, em Pipa. O percurso tem a forma de um funil. Começa na rede municipal, onde a política nacional é recebida, interpretada e convertida em planos, formações e orientações para escolas situadas em realidades muito diferentes, e chega à escola, onde os profissionais da educação que atuam nos anos iniciais do Ensino Fundamental, do 1º ao 5º ano, a interpretam, traduzem e recontextualizam no contexto da prática. Chamamos de profissionais da educação as professoras e os professores do 1º ao 5º ano, a coordenação pedagógica, a direção e os demais profissionais ligados aos processos pedagógicos ou à educação digital. Interessa-nos saber se e como a Secretaria considera a diversidade do território municipal ao traduzir a política e que peso têm, na escola, as culturas profissionais, as condições materiais e institucionais e as especificidades socioespaciais do lugar. O território, o funcionamento da rede e da escola e as condições de infraestrutura entram, assim, na análise como dimensões do contexto, e os documentos municipais, a entrevista com o técnico da Secretaria e as narrativas dos profissionais da escola constituem os caminhos para compreender como a política ganha forma no cotidiano escolar.</w:t>
       </w:r>
     </w:p>
     <w:p>
@@ -299,7 +299,7 @@
           <w:b w:val="0"/>
           <w:i w:val="0"/>
         </w:rPr>
-        <w:t>O eixo é relevante, também, por quem o faz acontecer. A própria lei reconhece a participação de diferentes sujeitos ao incluir, entre as estratégias prioritárias, a promoção das tecnologias digitais como ferramenta e conteúdo programático dos cursos de formação continuada de gestores e profissionais da educação de todos os níveis e modalidades de ensino (BRASIL, 2023, art. 3º, § 1º, X). Docentes, coordenação, direção e demais profissionais participam da encenação da política de modos diferentes, e o trabalho de cada um se estende para além da sala de aula. Por essa razão, escolhemos olhar a política a partir dessas pessoas.</w:t>
+        <w:t>O eixo é relevante, também, por quem o faz acontecer. A própria lei reconhece a participação de diferentes sujeitos ao incluir, entre as estratégias prioritárias, a promoção das tecnologias digitais como ferramenta e conteúdo programático dos cursos de formação continuada de gestores e profissionais da educação de todos os níveis e modalidades de ensino (BRASIL, 2023, art. 3º, § 1º, X). Docentes, coordenação, direção e demais profissionais participam da encenação da política de modos diferentes, e o trabalho de cada um se estende para além da sala de aula. A Resolução CNE/CEB nº 2/2025 atribui aos sistemas de ensino a definição das estratégias de formação continuada para a educação digital (BRASIL, 2025a, art. 37), e, numa rede municipal, essas estratégias passam pela Secretaria de Educação, de onde partem também as orientações que chegam às escolas. Por essa razão, escolhemos olhar a política a partir dessas pessoas, na Secretaria e na escola.</w:t>
       </w:r>
     </w:p>
     <w:p>
@@ -332,7 +332,7 @@
       </w:pPr>
       <w:r>
         <w:rPr/>
-        <w:t xml:space="preserve">A delimitação do campo em Pipa acrescenta à pesquisa condições próprias do território. O distrito integra um município de pequeno porte e, na década de 1970, era uma comunidade agrícola e pesqueira, sem energia elétrica, água encanada e boas vias de acesso, que passou a receber surfistas a partir de meados daquela década e, com a divulgação mais intensa iniciada nos anos 1990, se tornou destino turístico internacional (AIRES, 2012, p. 81-82). Para compreendê-lo, recorremos a Milton Santos, para quem “o território não é uma categoria de análise, a categoria de análise é o território usado” (SANTOS, 1999, p. 19). O território usado, explica o autor, deve ser visto “como um campo de forças, como o lugar do exercício, de dialéticas e contradições entre o vertical e o horizontal, entre o Estado e o mercado, entre o uso econômico e o uso social dos recursos” (SANTOS, 1999, p. 20). Em Pipa, essa contradição tem expressão concreta. O distrito onde pousadas, restaurantes e passeios se vendem pela internet é o mesmo de onde as crianças saem, pela manhã, para salas de aula com carteiras enfileiradas, alfabeto móvel feito à mão e nenhuma tela, situação que Santos (2006, p. 163) ajuda a nomear quando observa que, com a difusão do meio técnico-científico-informacional, “distinguem-se zonas servidas pelos meios de conhecimento e áreas desprovidas dessa vantagem”.</w:t>
+        <w:t>A delimitação do campo começa pelo município. Tibau do Sul tem 102,68 km² (IBGE, 2025) e tinha 16.929 habitantes no Censo de 2022 (IBGE, 2023); em 2010 eram 11.385, e cerca de 40% deles viviam em área rural (IBGE, 2011) [conferir na tabela do Censo 2010]. O IBGE reconhece no município apenas o distrito sede, mas o cotidiano se organiza em localidades com feições próprias: a sede, Pipa, Sibaúma, Piau e povoados como Umari, Bela Vista, Manimbu, Munim, Cabeceiras e Pernambuquinho, segundo levantamento preliminar a ser confirmado na relação oficial de localidades da Prefeitura. Sibaúma foi certificada como comunidade remanescente de quilombo pela Fundação Cultural Palmares por meio da Portaria nº 26, de 6 de junho de 2005 (FUNDAÇÃO CULTURAL PALMARES, 2005), e a presença de uma comunidade quilombola traz para a rede um marco normativo próprio, as Diretrizes Curriculares Nacionais para a Educação Escolar Quilombola (BRASIL, 2012). Uma política de alcance nacional, ao chegar a uma rede assim, precisa ser traduzida para escolas que não partilham as mesmas condições. Segundo o técnico da Secretaria Municipal de Educação, existe um plano elaborado para a rede como um todo [indicar nome, data e instância de aprovação do documento]. É a partir dele, dos demais documentos e das orientações municipais que a pesquisa pergunta se e como a Secretaria considera as especificidades de cada localidade ao traduzir a PNED.</w:t>
       </w:r>
     </w:p>
     <w:p>
@@ -343,7 +343,18 @@
       </w:pPr>
       <w:r>
         <w:rPr/>
-        <w:t xml:space="preserve">Doreen Massey (2008) acrescenta a essa leitura uma compreensão do lugar. Ao defini-lo, a autora escreve: “Trata-se, simplesmente, de um encontro de trajetórias” (MASSEY, 2008, p. 204). E explica: “o que é especial sobre o lugar é, precisamente, esse acabar juntos, o inevitável desafio de negociar um aqui-e-agora” (MASSEY, 2008, p. 203). Esse encontro acontece também dentro da escola. Com o turismo, casas e terrenos de nativos foram vendidos, trocados ou alugados a veranistas, surfistas e estrangeiros (AIRES, 2012, p. 79-80, 84), e os relatos reunidos pela autora incluem trabalhadoras vindas de localidades vizinhas para os serviços ligados ao turismo (AIRES, 2012, p. 16, 87). As crianças atendidas pela escola vêm de famílias de moradores antigos, de migrantes, de estrangeiros e de pessoas ligadas ao turismo, com condições diversas de acesso às tecnologias. Na mesma turma reúnem-se experiências digitais desiguais, e a negociação desse “aqui-e-agora” cabe, em grande parte, aos profissionais da educação. A PNED contempla populações vulneráveis, crianças e adolescentes e estudantes com deficiência (BRASIL, 2023, art. 1º; art. 3º, IV e V), sem prever, em sua formulação, as particularidades dessa diversidade territorial. Massey ajuda, ainda, a evitar que a distância entre a escola e os circuitos turísticos seja lida como atraso, ao criticar a operação que “transforma a geografia em história, o espaço em tempo” (MASSEY, 2008, p. 24). Escola e polo turístico são contemporâneos, e o que os separa são relações que a análise precisará explicar.</w:t>
+        <w:t>Pipa, onde a escola está, acrescenta à pesquisa condições próprias. Na década de 1970, a localidade era uma comunidade agrícola e pesqueira, sem energia elétrica, água encanada e boas vias de acesso, que passou a receber surfistas a partir de meados daquela década e, com a divulgação mais intensa iniciada nos anos 1990, se tornou destino turístico internacional (AIRES, 2012, p. 81-82). Para compreender esse território, recorremos a Milton Santos, para quem “o território não é uma categoria de análise, a categoria de análise é o território usado” (SANTOS, 1999, p. 19). O território usado, explica o autor, deve ser visto “como um campo de forças, como o lugar do exercício, de dialéticas e contradições entre o vertical e o horizontal, entre o Estado e o mercado, entre o uso econômico e o uso social dos recursos” (SANTOS, 1999, p. 20). Em Pipa, essa contradição tem expressão concreta. A localidade onde pousadas, restaurantes e passeios se vendem pela internet é a mesma de onde as crianças saem, pela manhã, para salas de aula com carteiras enfileiradas, alfabeto móvel feito à mão e nenhuma tela, situação que Santos (2006, p. 163) ajuda a nomear quando observa que, com a difusão do meio técnico-científico-informacional, “distinguem-se zonas servidas pelos meios de conhecimento e áreas desprovidas dessa vantagem”.</w:t>
+      </w:r>
+    </w:p>
+    <w:p>
+      <w:pPr>
+        <w:spacing w:line="360" w:lineRule="auto" w:after="0" w:before="0"/>
+        <w:ind w:firstLine="709"/>
+        <w:jc w:val="both"/>
+      </w:pPr>
+      <w:r>
+        <w:rPr/>
+        <w:t>Doreen Massey (2008) acrescenta a essa leitura uma compreensão do lugar. Ao defini-lo, a autora escreve: “Trata-se, simplesmente, de um encontro de trajetórias” (MASSEY, 2008, p. 204). E explica: “o que é especial sobre o lugar é, precisamente, esse acabar juntos, o inevitável desafio de negociar um aqui-e-agora” (MASSEY, 2008, p. 203). Esse encontro acontece também dentro da escola. Com o turismo, casas e terrenos de nativos foram vendidos, trocados ou alugados a veranistas, surfistas e estrangeiros (AIRES, 2012, p. 79-80, 84), e os relatos reunidos pela autora incluem trabalhadoras vindas de localidades vizinhas para os serviços ligados ao turismo (AIRES, 2012, p. 16, 87). As crianças atendidas pela escola vêm de famílias de moradores antigos, de migrantes, de estrangeiros e de pessoas ligadas ao turismo, com condições diversas de acesso às tecnologias. Na mesma turma reúnem-se experiências digitais desiguais, e a negociação desse “aqui-e-agora” cabe, em grande parte, aos profissionais da educação. A PNED contempla populações vulneráveis, crianças e adolescentes e estudantes com deficiência (BRASIL, 2023, art. 1º; art. 3º, IV e V), sem prever, em sua formulação, as particularidades dessa diversidade territorial. Cabe à rede municipal, em primeiro lugar, traduzi-la para lugares tão diferentes quanto Pipa, Sibaúma e os povoados rurais, e cabe à escola, em seguida, traduzir a orientação recebida para as crianças que atende. Massey ajuda, ainda, a evitar que a distância entre a escola e os circuitos turísticos seja lida como atraso, ao criticar a operação que “transforma a geografia em história, o espaço em tempo” (MASSEY, 2008, p. 24). Escola e polo turístico são contemporâneos, e o que os separa são relações que a análise precisará explicar.</w:t>
       </w:r>
     </w:p>
     <w:p>
@@ -371,7 +382,7 @@
           <w:b w:val="0"/>
           <w:i w:val="0"/>
         </w:rPr>
-        <w:t>A posição da pesquisadora integra esse quadro. Freire (2019, p. 96) afirma: “Neutra, ‘indiferente’ a qualquer destas hipóteses, a da reprodução da ideologia dominante ou a de sua contestação, a educação jamais foi, é, ou pode ser”. Esta pesquisa, dedicada à educação, assume a mesma condição. A tese tem objeto, pergunta e desenho próprios e não dá continuidade à pesquisa de mestrado, uma pesquisa-ação realizada durante a pandemia com uma turma de 2º ano da mesma escola. Do mestrado, guarda a familiaridade com a escola, somada a quase vinte anos de convivência com o território de Pipa, onde a pesquisadora residiu, e com a administração pública municipal, na qual atua como profissional técnica de políticas públicas. Essa trajetória trouxe conhecimento sobre a dinâmica local, sobre os caminhos institucionais pelos quais as políticas chegam às escolas e sobre o modo como a rede nomeia e compreende esses processos. A proximidade faz parte das condições da investigação e pede cuidado para que o saber prévio da pesquisadora não se sobreponha ao que o campo mostrar. Como o município é um dos entes federados aos quais a lei distribui a responsabilidade pelos meios, a pesquisadora olha o problema de dentro, e as relações institucionais no território pedem cuidado redobrado para que essa posição não limite a liberdade dos participantes em suas narrativas.</w:t>
+        <w:t>A posição da pesquisadora integra esse quadro. Freire (2019, p. 96) afirma: “Neutra, ‘indiferente’ a qualquer destas hipóteses, a da reprodução da ideologia dominante ou a de sua contestação, a educação jamais foi, é, ou pode ser”. Esta pesquisa, dedicada à educação, assume a mesma condição. A tese tem objeto, pergunta e desenho próprios e não dá continuidade à pesquisa de mestrado, uma pesquisa-ação realizada durante a pandemia com uma turma de 2º ano da mesma escola. Do mestrado, guarda a familiaridade com a escola, somada a quase vinte anos de convivência com o território de Pipa, onde a pesquisadora residiu, e com a administração pública municipal, na qual atua como profissional técnica de políticas públicas. Essa trajetória trouxe conhecimento sobre a dinâmica local, sobre os caminhos institucionais pelos quais as políticas chegam às escolas e sobre o modo como a rede nomeia e compreende esses processos. A proximidade faz parte das condições da investigação e pede cuidado para que o saber prévio da pesquisadora não se sobreponha ao que o campo mostrar. Como o município é um dos entes federados aos quais a lei distribui a responsabilidade pelos meios, a pesquisadora olha o problema de dentro, e as relações institucionais no território pedem cuidado redobrado para que essa posição não limite a liberdade dos participantes em suas narrativas. O mesmo cuidado vale para a entrevista com o técnico da Secretaria, instância da administração municipal em que a pesquisadora atua.</w:t>
       </w:r>
     </w:p>
     <w:p>
@@ -461,7 +472,7 @@
           <w:b w:val="0"/>
           <w:i w:val="0"/>
         </w:rPr>
-        <w:t>Os indicadores nacionais ajudam a dimensionar essa distância. De acordo com a TIC Educação 2024, pesquisa do Comitê Gestor da Internet no Brasil (CGI.BR, 2025a), 96% das escolas brasileiras possuíam acesso à internet, percentual de 94% na rede municipal. A proporção de escolas com computadores disponíveis para os alunos passou de 60%, em 2020, para 59%, em 2024, e, nas escolas rurais, caiu de 36% para 28%. No mesmo ano, a TIC Domicílios 2024 registrou acesso à internet em 83% dos domicílios brasileiros (CGI.BR, 2025b). Os dados mostram a chegada da conexão às escolas sem crescimento equivalente dos equipamentos para os estudantes, e, nas escolas rurais, menos de três em cada dez dispunham, em 2024, de computadores para uso dos alunos. Ter internet na escola é insuficiente para que a conexão se torne experiência educativa quando falta o meio de levar o digital ao trabalho pedagógico.</w:t>
+        <w:t>Os indicadores nacionais ajudam a dimensionar essa distância. De acordo com a TIC Educação 2024, pesquisa do Comitê Gestor da Internet no Brasil (CGI.BR, 2025a), 96% das escolas brasileiras possuíam acesso à internet, percentual de 94% na rede municipal. A proporção de escolas com computadores disponíveis para os alunos passou de 60%, em 2020, para 59%, em 2024, e, nas escolas rurais, caiu de 36% para 28%. No mesmo ano, a TIC Domicílios 2024 registrou acesso à internet em 83% dos domicílios brasileiros (CGI.BR, 2025b). Os dados mostram a chegada da conexão às escolas sem crescimento equivalente dos equipamentos para os estudantes, e, nas escolas rurais, menos de três em cada dez dispunham, em 2024, de computadores para uso dos alunos. Ter internet na escola é insuficiente para que a conexão se torne experiência educativa quando falta o meio de levar o digital ao trabalho pedagógico. Em Tibau do Sul, onde parte das escolas municipais fica em localidades rurais [confirmar no Censo Escolar], o dado diz respeito à própria rede investigada.</w:t>
       </w:r>
     </w:p>
     <w:p>
@@ -542,7 +553,7 @@
       </w:pPr>
       <w:r>
         <w:rPr/>
-        <w:t xml:space="preserve">O desenho da lei, a capacidade da rede, o tempo de trabalho, as desigualdades do território e a lacuna da literatura convergem, assim, para o trabalho de mediação realizado pelos profissionais em suas diferentes posições, feito de interpretações, traduções, escolhas e limites, no qual a análise se concentra.</w:t>
+        <w:t>O desenho da lei, a capacidade da rede, o tempo de trabalho, as desigualdades do território e a lacuna da literatura convergem, assim, para o trabalho de mediação realizado na Secretaria e na escola pelos profissionais, em suas diferentes posições, feito de interpretações, traduções, escolhas e limites, no qual a análise se concentra.</w:t>
       </w:r>
     </w:p>
     <w:p>
@@ -564,7 +575,7 @@
           <w:b w:val="0"/>
           <w:i w:val="0"/>
         </w:rPr>
-        <w:t xml:space="preserve">Desse percurso nasce a questão que orienta a investigação: como os profissionais da educação encenam e recontextualizam a Política Nacional de Educação Digital no contexto da prática da Escola Municipal Domitila Castelo da Silva, em Pipa (RN), e como as culturas profissionais, as condições materiais e institucionais da escola e as especificidades socioespaciais do território atravessam esse processo, produzindo diferentes formas de atuação, entre as quais podem emergir acomodações, negociações, ressignificações e resistências?</w:t>
+        <w:t>Desse percurso nasce a questão que orienta a investigação: como a Política Nacional de Educação Digital é recontextualizada pela Secretaria Municipal de Educação de Tibau do Sul (RN), num território municipal que reúne áreas urbanas e rurais, povoados com realidades distintas e uma comunidade quilombola, e como essa recontextualização chega à Escola Municipal Domitila Castelo da Silva, em Pipa, onde os profissionais da educação a encenam, atravessados pelas culturas profissionais, pelas condições materiais e institucionais da escola e pelas especificidades do lugar, produzindo diferentes formas de atuação, entre as quais podem emergir acomodações, negociações, ressignificações e resistências?</w:t>
       </w:r>
     </w:p>
     <w:p>
@@ -575,7 +586,7 @@
       </w:pPr>
       <w:r>
         <w:rPr/>
-        <w:t xml:space="preserve">Formulamos a questão de modo a manter aberto o seu resultado. Ainda não sabemos se a PNED será acolhida, adaptada, posta de lado ou contestada pelos profissionais da escola, e pressupor qualquer uma dessas respostas comprometeria a investigação antes de ela começar. Buscamos conhecer as maneiras de agir diante da política e as condições que tornam algumas delas possíveis e outras pouco prováveis. A teoria da atuação sustenta essa abertura, já que as políticas “raramente ditam ou determinam a prática, mas algumas mais do que outras estreitam a gama de respostas criativas” (BALL; MAGUIRE; BRAUN, 2016, p. 14). A resistência, nomeada no título, entra nesse quadro como possibilidade de interesse, que poderá aparecer ou não nos dados e que, se aparecer, será lida em relação às condições em que se constitui, às demandas a que responde e aos efeitos que produz no cotidiano escolar.</w:t>
+        <w:t>Formulamos a questão de modo a manter aberto o seu resultado. Ainda não sabemos se a PNED será acolhida, adaptada, posta de lado ou contestada pela Secretaria e pelos profissionais da escola, e pressupor qualquer uma dessas respostas comprometeria a investigação antes de ela começar. Buscamos conhecer as maneiras de agir diante da política e as condições que tornam algumas delas possíveis e outras pouco prováveis. A teoria da atuação sustenta essa abertura, já que as políticas “raramente ditam ou determinam a prática, mas algumas mais do que outras estreitam a gama de respostas criativas” (BALL; MAGUIRE; BRAUN, 2016, p. 14). A resistência, nomeada no título, entra nesse quadro como possibilidade de interesse, que poderá aparecer ou não nos dados e que, se aparecer, será lida em relação às condições em que se constitui, às demandas a que responde e aos efeitos que produz no cotidiano escolar.</w:t>
       </w:r>
     </w:p>
     <w:p>
@@ -589,7 +600,7 @@
           <w:b w:val="0"/>
           <w:i w:val="0"/>
         </w:rPr>
-        <w:t xml:space="preserve">O objetivo geral é analisar como os profissionais da educação encenam e recontextualizam a Política Nacional de Educação Digital no contexto da prática da Escola Municipal Domitila Castelo da Silva, em Pipa (RN), considerando as relações entre a política, as culturas profissionais, as condições materiais e institucionais da escola e as especificidades socioespaciais do território. São objetivos específicos:</w:t>
+        <w:t>O objetivo geral é analisar a recontextualização da Política Nacional de Educação Digital da Secretaria Municipal de Educação de Tibau do Sul até o contexto da prática da Escola Municipal Domitila Castelo da Silva, em Pipa, considerando a diversidade socioespacial do território municipal, as culturas profissionais e as condições materiais e institucionais da rede e da escola. São objetivos específicos:</w:t>
       </w:r>
     </w:p>
     <w:p>
@@ -603,7 +614,7 @@
           <w:b w:val="0"/>
           <w:i w:val="0"/>
         </w:rPr>
-        <w:t>a) compreender como os diferentes profissionais da educação interpretam os textos da PNED e os discursos sobre educação digital, considerando suas experiências, crenças, valores e formas de organização do trabalho;</w:t>
+        <w:t>a) analisar a recontextualização da PNED pela Secretaria Municipal de Educação em planos, currículos, formações e orientações para a rede, considerando as especificidades das localidades do município, entre elas as áreas rurais e a comunidade quilombola de Sibaúma;</w:t>
       </w:r>
     </w:p>
     <w:p>
@@ -617,7 +628,7 @@
           <w:b w:val="0"/>
           <w:i w:val="0"/>
         </w:rPr>
-        <w:t>b) analisar como as condições materiais e institucionais da escola, articuladas às especificidades socioespaciais do território, atravessam os processos de tradução e recontextualização da PNED em ações, escolhas e práticas cotidianas;</w:t>
+        <w:t>b) compreender a interpretação da PNED e das orientações municipais pelos profissionais da escola, à luz de suas experiências, crenças, valores e formas de organização do trabalho;</w:t>
       </w:r>
     </w:p>
     <w:p>
@@ -631,7 +642,7 @@
           <w:b w:val="0"/>
           <w:i w:val="0"/>
         </w:rPr>
-        <w:t>c) identificar as diferentes formas de atuação produzidas diante da política, com atenção às situações em que emergem adesão, acomodação, adaptação, omissão seletiva, negociação, ressignificação ou resistência;</w:t>
+        <w:t>c) examinar a relação entre as condições materiais e institucionais da escola, articuladas às especificidades de Pipa no território municipal, e a tradução da política em ações, escolhas e práticas cotidianas;</w:t>
       </w:r>
     </w:p>
     <w:p>
@@ -645,7 +656,7 @@
           <w:b w:val="0"/>
           <w:i w:val="0"/>
         </w:rPr>
-        <w:t>d) discutir as implicações das diferentes formas de encenação da PNED para a educação digital das crianças, considerando as possibilidades de provisão, proteção e participação no ambiente digital.</w:t>
+        <w:t>d) identificar as formas de atuação produzidas diante da política e das orientações municipais, da adesão à resistência, e suas implicações para a provisão, a proteção e a participação das crianças no ambiente digital.</w:t>
       </w:r>
     </w:p>
     <w:p>
@@ -656,7 +667,7 @@
       </w:pPr>
       <w:r>
         <w:rPr/>
-        <w:t xml:space="preserve">Os quatro objetivos acompanham o caminho que a política percorre até chegar às crianças. O primeiro se detém nos sujeitos e no modo como leem a política a partir do que já sabem, acreditam e praticam. O segundo leva essa leitura para as condições em que ela acontece, dentro da escola e no território, e é nele que Pipa entra como dimensão do contexto da política. O terceiro reúne os dois anteriores para perguntar o que os profissionais efetivamente fazem com a PNED, sem estabelecer previamente qual forma de atuação deve prevalecer. O quarto acompanha a política até as crianças, a quem ela se dirige e em nome de quem se justifica, e examina como as formas de encenação identificadas ampliam, limitam ou reorganizam as possibilidades de provisão, proteção e participação (ONU, 2021). As crianças não participam da produção de dados, e o que se poderá dizer sobre elas virá das condições documentadas e das compreensões dos profissionais.</w:t>
+        <w:t>Os quatro objetivos acompanham, em forma de funil, o caminho que a política percorre até chegar às crianças. O primeiro se detém na rede municipal e pergunta como a Secretaria converte a PNED em planos, formações e orientações e se esses materiais consideram as diferenças entre as localidades do município, das áreas rurais à comunidade quilombola de Sibaúma; é nele que a dimensão externa do contexto ganha fonte própria. O segundo chega aos sujeitos da escola e ao modo como leem a política e as orientações municipais a partir do que já sabem, acreditam e praticam, e por isso dialoga com a discussão de Hargreaves (2005) sobre as culturas do trabalho docente. O terceiro leva essa leitura às condições em que ela acontece, dentro da escola e em Pipa, naquilo que Ball, Maguire e Braun (2016, p. 38) chamam de contextos situados, que incluem a localidade, as histórias escolares e as matrículas. O quarto reúne os anteriores para perguntar o que os profissionais efetivamente fazem com a PNED, sem estabelecer previamente qual forma de atuação deve prevalecer, e acompanha a política até as crianças, a quem ela se dirige e em nome de quem se justifica, examinando como essas formas de atuação ampliam, limitam ou reorganizam as possibilidades de provisão, proteção e participação no ambiente digital (ONU, 2021). As crianças não participam da produção de dados, e o que se poderá dizer sobre elas virá das condições documentadas e das compreensões dos profissionais.</w:t>
       </w:r>
     </w:p>
     <w:p>
@@ -675,7 +686,7 @@
       </w:pPr>
       <w:r>
         <w:rPr/>
-        <w:t xml:space="preserve">A ACP oferece a matriz para compreender a trajetória da PNED, dos contextos de influência e de produção do texto ao contexto da prática, que ocupa posição privilegiada na pesquisa (BOWE; BALL; GOLD, 1992; MAINARDES, 2006). A teoria da atuação de Ball, Maguire e Braun (2016) é o principal dispositivo analítico, e nela “a política é complexamente codificada em textos e artefatos e é decodificada (e recodificada) de forma igualmente complexa” (BALL; MAGUIRE; BRAUN, 2016, p. 14). Os autores propõem quatro dimensões do contexto (BALL; MAGUIRE; BRAUN, 2016, p. 38): a situacional, que reúne a história da escola, sua localização e a composição de seu público; a das culturas profissionais; a material, que compreende infraestrutura, espaços, equipamentos, conectividade e recursos; e a externa, que abrange as pressões e os apoios vindos de fora, como as orientações da rede e as relações com outras instâncias de governo. Para eles, “o contexto é uma força ‘ativa’, não é apenas um pano de fundo com os quais as escolas têm de operar” (BALL; MAGUIRE; BRAUN, 2016, p. 42). A performatividade (BALL, 2004, 2008) e as fabricações, que Ball (2002) descreve como versões de uma instituição ou de uma prática produzidas para serem avaliadas, entram como lentes para examinar se a política chega acompanhada de exigências de registro e demonstração e como os profissionais respondem a elas. Essas noções orientam o olhar sobre os dados sem antecipar o que será encontrado.</w:t>
+        <w:t>A ACP oferece a matriz para compreender a trajetória da PNED, dos contextos de influência e de produção do texto ao contexto da prática, que ocupa posição privilegiada na pesquisa (BOWE; BALL; GOLD, 1992; MAINARDES, 2006). A teoria da atuação de Ball, Maguire e Braun (2016) é o principal dispositivo analítico, e nela “a política é complexamente codificada em textos e artefatos e é decodificada (e recodificada) de forma igualmente complexa” (BALL; MAGUIRE; BRAUN, 2016, p. 14). Os autores propõem quatro dimensões do contexto (BALL; MAGUIRE; BRAUN, 2016, p. 38): a situacional, que reúne a história da escola, sua localização e a composição de seu público; a das culturas profissionais; a material, que compreende infraestrutura, espaços, equipamentos, conectividade e recursos; e a externa, que abrange as pressões e os apoios vindos de fora, como as orientações da rede e as relações com outras instâncias de governo, e que tem nesta pesquisa, na Secretaria Municipal de Educação, sua fonte principal. Para eles, “o contexto é uma força ‘ativa’, não é apenas um pano de fundo com os quais as escolas têm de operar” (BALL; MAGUIRE; BRAUN, 2016, p. 42). A performatividade (BALL, 2004, 2008) e as fabricações, que Ball (2002) descreve como versões de uma instituição ou de uma prática produzidas para serem avaliadas, entram como lentes para examinar se a política chega acompanhada de exigências de registro e demonstração e como os profissionais respondem a elas. Essas noções orientam o olhar sobre os dados sem antecipar o que será encontrado.</w:t>
       </w:r>
     </w:p>
     <w:p>
@@ -706,7 +717,7 @@
       </w:r>
       <w:r>
         <w:rPr/>
-        <w:t xml:space="preserve">, lembra que “as rugosidades – formas remanescentes dos períodos anteriores – devem ser levadas em conta quando uma sociedade procura impor novas funções” (SANTOS, 2012, p. 75). Massey, por sua vez, compreende o espaço “como a esfera da possibilidade da existência da multiplicidade, no sentido da pluralidade contemporânea, como a esfera na qual distintas trajetórias coexistem” (MASSEY, 2008, p. 29), o que permite ler Pipa como lugar de encontro de trajetórias que chegam à escola na forma das famílias e das crianças que ela atende.</w:t>
+        <w:t>, lembra que “as rugosidades – formas remanescentes dos períodos anteriores – devem ser levadas em conta quando uma sociedade procura impor novas funções” (SANTOS, 2012, p. 75). Massey, por sua vez, compreende o espaço “como a esfera da possibilidade da existência da multiplicidade, no sentido da pluralidade contemporânea, como a esfera na qual distintas trajetórias coexistem” (MASSEY, 2008, p. 29), o que permite ler Tibau do Sul como conjunto de lugares onde se encontram trajetórias diversas, da sede às localidades rurais, de Sibaúma a Pipa, e ler Pipa como lugar de encontro de trajetórias que chegam à escola na forma das famílias e das crianças que ela atende.</w:t>
       </w:r>
     </w:p>
     <w:p>
@@ -717,7 +728,7 @@
       </w:pPr>
       <w:r>
         <w:rPr/>
-        <w:t xml:space="preserve">Para responder à questão, adotamos abordagem qualitativa, de natureza interpretativa (MINAYO, 2009), e organizamos a investigação como estudo de caso único. Yin (2001, p. 32) define o estudo de caso como “uma investigação empírica que investiga um fenômeno contemporâneo dentro de seu contexto da vida real, especialmente quando os limites entre o fenômeno e o contexto não estão claramente definidos”. É a situação desta pesquisa, na qual infraestrutura, formação, cultura escolar e desigualdades do território condicionam a política e fazem parte dela ao mesmo tempo. O caso interessa pelo que permite compreender a fundo de uma realidade singular, sem pretensão de representar outras escolas.</w:t>
+        <w:t>Para responder à questão, adotamos abordagem qualitativa, de natureza interpretativa (MINAYO, 2009), e organizamos a investigação como estudo de caso único com unidades incorporadas (YIN, 2001) [indicar a página na edição usada]. Yin (2001, p. 32) define o estudo de caso como “uma investigação empírica que investiga um fenômeno contemporâneo dentro de seu contexto da vida real, especialmente quando os limites entre o fenômeno e o contexto não estão claramente definidos”. É a situação desta pesquisa, na qual infraestrutura, formação, cultura escolar e desigualdades do território condicionam a política e fazem parte dela ao mesmo tempo. O caso é a encenação da PNED na rede municipal de Tibau do Sul, e as unidades de análise são a Secretaria Municipal de Educação, onde a política é traduzida para o município, e a Escola Municipal Domitila Castelo da Silva, onde ela chega ao contexto da prática. A análise parte da rede e do território municipal e se estreita até a escola, a única instituição de ensino em que os profissionais serão ouvidos. O caso interessa pelo que permite compreender a fundo de uma realidade singular, sem pretensão de representar outras redes ou escolas.</w:t>
       </w:r>
     </w:p>
     <w:p>
@@ -731,7 +742,7 @@
           <w:b w:val="0"/>
           <w:i w:val="0"/>
         </w:rPr>
-        <w:t xml:space="preserve">Participam os profissionais da educação que atuam nos anos iniciais da escola e aceitarem o convite: docentes do 1º ao 5º ano, coordenação pedagógica, direção e demais profissionais ligados aos processos pedagógicos ou à educação digital, num total de 24 profissionais: o diretor, a vice-diretora, a coordenadora pedagógica, quatro profissionais do apoio pedagógico e dezessete docentes, dos quais quinze regentes e dois no apoio à recomposição de aula. Participa também um técnico da Secretaria Municipal de Educação, o coordenador de políticas públicas e programas educacionais do município. Sua escuta é fonte complementar sobre o contexto externo, isto é, sobre como as orientações nacionais são recebidas e encaminhadas pela gestão municipal antes de chegar à escola, e a unidade do estudo permanece na encenação da PNED na Escola Municipal Domitila Castelo da Silva.</w:t>
+        <w:t>Participam os profissionais da educação que atuam nos anos iniciais da escola e aceitarem o convite: docentes do 1º ao 5º ano, coordenação pedagógica, direção e demais profissionais ligados aos processos pedagógicos ou à educação digital, num total de 24 profissionais: o diretor, a vice-diretora, a coordenadora pedagógica, quatro profissionais do apoio pedagógico e dezessete docentes, dos quais quinze regentes e dois no apoio à recomposição de aula. Participa também um técnico da Secretaria Municipal de Educação, o coordenador de políticas públicas e programas educacionais do município, único participante da Secretaria. Sua entrevista abre a investigação e é a principal fonte oral sobre a dimensão externa do contexto: como as orientações nacionais são recebidas e traduzidas pela gestão municipal, que plano, formações e orientações foram produzidos para a rede e se esses materiais consideram as especificidades das localidades, antes de a análise chegar à escola.</w:t>
       </w:r>
     </w:p>
     <w:p>
@@ -742,7 +753,7 @@
       </w:pPr>
       <w:r>
         <w:rPr/>
-        <w:t xml:space="preserve">Os dados serão construídos em cinco movimentos. O primeiro é a análise documental da Lei nº 14.533/2023, da Resolução CNE/CEB nº 2/2025, dos documentos curriculares, dos documentos da Secretaria Municipal de Educação e dos registros da escola, entre eles o Projeto Político-Pedagógico (PPP), os planos de aula, as atas e os registros de formação. O segundo é o registro iconográfico, com 38 imagens reunidas a partir da escola e do acervo do Museu Digital de Pipa, lidas com a noção de rugosidade e com a leitura do lugar proposta por Massey. O terceiro é um questionário de perfil e percepções, com função descritiva. O quarto são entrevistas individuais semiestruturadas, com os profissionais da escola e com o técnico da Secretaria, nas quais as noções de resistência, performatividade e fabricação não serão apresentadas nominalmente, para que os participantes descrevam suas experiências nos próprios termos. O quinto reúne as fontes pela análise temática reflexiva (BRAUN; CLARKE, 2006, 2019), com triangulação entre documentos, imagens, questionário e entrevistas, e se encerra com a devolutiva dos resultados à escola e à Secretaria. A pesquisa não observa aulas, e as práticas chegam à análise pelas narrativas dos participantes, enquanto as condições materiais chegam pelos documentos e pelo registro iconográfico. Ball, Maguire e Braun (2016, p. 49) adotaram a mesma delimitação no estudo que deu origem à teoria da atuação: “a prática de sala de aula não era foco do estudo [...] nós temos de confiar nos relatos dos professores nessas questões”. O registro iconográfico e a consulta ao acervo histórico já foram realizados e sustentam o Capítulo 6. Os demais movimentos dependem da aprovação, pelo Comitê de Ética em Pesquisa, da emenda ao protocolo já aprovado.</w:t>
+        <w:t>Os dados serão construídos em cinco movimentos, ordenados da rede municipal à escola. O primeiro é a análise documental, em três planos: no nacional, a Lei nº 14.533/2023, a Resolução CNE/CEB nº 2/2025 e os documentos curriculares; no municipal, o plano elaborado pela Secretaria para a rede, o currículo, os registros de formação, as orientações enviadas às escolas e o Plano Municipal de Educação (TIBAU DO SUL, 2015), lidos com a pergunta sobre se e como diferenciam as localidades do município; no escolar, o Projeto Político-Pedagógico (PPP), os planos de aula, as atas e os registros de formação. Parte desses documentos já foi solicitada ao técnico da Secretaria e à direção da escola. O segundo é a leitura do território municipal, com dados do IBGE e do Censo Escolar sobre a distribuição da população e das escolas entre as localidades, acompanhada do registro iconográfico da escola de Pipa, com 38 imagens reunidas a partir da escola e do acervo do Museu Digital de Pipa, lidas com a noção de rugosidade e com a leitura do lugar proposta por Massey. O terceiro é um questionário de perfil e percepções, com função descritiva. O quarto são entrevistas individuais semiestruturadas, a primeira com o técnico da Secretaria e as demais com os profissionais da escola, nas quais as noções de resistência, performatividade e fabricação não serão apresentadas nominalmente, para que os participantes descrevam suas experiências nos próprios termos. O quinto reúne as fontes pela análise temática reflexiva (BRAUN; CLARKE, 2006, 2019), com triangulação entre documentos, dados do território, imagens, questionário e entrevistas, e se encerra com a devolutiva dos resultados à escola e à Secretaria. A pesquisa não observa aulas, e as práticas chegam à análise pelas narrativas dos participantes, enquanto as condições materiais chegam pelos documentos, pelos dados do território e pelo registro iconográfico. Ball, Maguire e Braun (2016, p. 49) adotaram a mesma delimitação no estudo que deu origem à teoria da atuação: “a prática de sala de aula não era foco do estudo [...] nós temos de confiar nos relatos dos professores nessas questões”. O registro iconográfico e a consulta ao acervo histórico já foram realizados e sustentam o Capítulo 6. Os demais movimentos dependem da aprovação, pelo Comitê de Ética em Pesquisa, da emenda ao protocolo já aprovado, que incluirá a Secretaria Municipal de Educação como instituição coparticipante e ainda será submetida.</w:t>
       </w:r>
     </w:p>
     <w:p>
@@ -778,7 +789,7 @@
           <w:b w:val="0"/>
           <w:i w:val="0"/>
         </w:rPr>
-        <w:t>A pesquisa parte da compreensão de que a PNED chega à escola como um conjunto de orientações que precisa ser lido e interpretado por quem trabalha nela. Ao encontrar uma escola situada, com seus profissionais, sua história, suas condições materiais, suas relações institucionais e seu território, a política passa por processos de interpretação, tradução e recontextualização (BOWE; BALL; GOLD, 1992; MAINARDES, 2006; BALL; MAGUIRE; BRAUN, 2016). A hipótese interpretativa que orienta o estudo é a de que a forma assumida pela política no cotidiano escolar resulta da relação entre o que ela prescreve e as condições sob as quais os profissionais precisam atuar. Dessa relação podem surgir formas de adesão, acomodação, adaptação, omissão seletiva, negociação, ressignificação e resistência, e ainda outras que não previmos, sem que pressuponhamos a predominância de nenhuma delas.</w:t>
+        <w:t>A pesquisa parte da compreensão de que a PNED chega à rede municipal e à escola como um conjunto de orientações que precisa ser lido e interpretado por quem trabalha nelas. Ao passar pela Secretaria Municipal de Educação, a política é traduzida para um território diverso, e ao encontrar uma escola situada, com seus profissionais, sua história, suas condições materiais, suas relações institucionais e seu território, passa por novos processos de interpretação, tradução e recontextualização (BOWE; BALL; GOLD, 1992; MAINARDES, 2006; BALL; MAGUIRE; BRAUN, 2016). A hipótese interpretativa que orienta o estudo é a de que a forma assumida pela política no cotidiano escolar resulta da relação entre o que ela prescreve, o que a rede municipal traduz e as condições sob as quais os profissionais precisam atuar. Dessa relação podem surgir formas de adesão, acomodação, adaptação, omissão seletiva, negociação, ressignificação e resistência, e ainda outras que não previmos, sem que pressuponhamos a predominância de nenhuma delas.</w:t>
       </w:r>
     </w:p>
     <w:p>
@@ -940,7 +951,7 @@
       </w:r>
       <w:r>
         <w:rPr/>
-        <w:t xml:space="preserve">, Di Felice (2009) mostra como as tecnologias comunicativas transformam a relação entre sujeito, meios e território. Ao tratar da imprensa, afirma que “a invenção da escrita artificial coincide, de fato, com o surgimento de uma espacialidade artificial que marcará sobremaneira a Renascença e inaugurará um novo modo de habitar” (DI FELICE, 2009, p. 102), e, com as redes digitais, descreve um habitar atópico, realizado por meio de interações com interfaces, em ecossistemas informativos nos quais sujeito e território se relacionam em rede (DI FELICE, 2009, p. 20). Somadas às leituras de Santos e de Massey, essas contribuições permitem nomear uma tensão específica de Pipa, a coexistência de elevada densidade tecnológica nos circuitos econômicos e turísticos do distrito com uma disponibilidade muito mais limitada de tecnologias nos espaços pedagógicos da escola, que Santos (1999, p. 20-21) ajuda a entender como “dissonância entre os usos econômicos e os usos sociais dos mesmos recursos”. A segunda formulação é a de rugosidade tecnológica, que nomeia as estruturas deixadas por iniciativas anteriores à política vigente e ainda presentes na escola. O laboratório de informática, segundo informações preliminares montado pela Prefeitura em 2022, é um exemplo, pois a PNED atribui nova função a equipamentos de uma iniciativa anterior a ela, num movimento que Santos descreve ao observar que a forma “freqüentemente permanece aguardando o próximo movimento dinâmico da sociedade, quando terá toda a probabilidade de ser chamada a cumprir uma nova função” (SANTOS, 2012, p. 74-75). A terceira é a de vazio material, construída no Capítulo 5 para nomear o resultado do desenho da lei quando a rede não consegue mobilizar os meios. Essas formulações dizem respeito às condições do contexto e serão confrontadas com os dados, podendo ser aprofundadas, revistas ou tensionadas; as formas de atuação dizem respeito à ação dos profissionais, e só as entrevistas poderão mostrá-las.</w:t>
+        <w:t>, Di Felice (2009) mostra como as tecnologias comunicativas transformam a relação entre sujeito, meios e território. Ao tratar da imprensa, afirma que “a invenção da escrita artificial coincide, de fato, com o surgimento de uma espacialidade artificial que marcará sobremaneira a Renascença e inaugurará um novo modo de habitar” (DI FELICE, 2009, p. 102), e, com as redes digitais, descreve um habitar atópico, realizado por meio de interações com interfaces, em ecossistemas informativos nos quais sujeito e território se relacionam em rede (DI FELICE, 2009, p. 20). Somadas às leituras de Santos e de Massey, essas contribuições permitem nomear uma tensão específica de Pipa, a coexistência de elevada densidade tecnológica nos circuitos econômicos e turísticos da localidade com uma disponibilidade muito mais limitada de tecnologias nos espaços pedagógicos da escola, que Santos (1999, p. 20-21) ajuda a entender como “dissonância entre os usos econômicos e os usos sociais dos mesmos recursos”. A segunda formulação é a de rugosidade tecnológica, que nomeia as estruturas deixadas por iniciativas anteriores à política vigente e ainda presentes na escola. O laboratório de informática, segundo informações preliminares montado pela Prefeitura em 2022, é um exemplo, pois a PNED atribui nova função a equipamentos de uma iniciativa anterior a ela, num movimento que Santos descreve ao observar que a forma “freqüentemente permanece aguardando o próximo movimento dinâmico da sociedade, quando terá toda a probabilidade de ser chamada a cumprir uma nova função” (SANTOS, 2012, p. 74-75). A terceira é a de vazio material, construída no Capítulo 5 para nomear o resultado do desenho da lei quando a rede não consegue mobilizar os meios. Essas formulações dizem respeito às condições do contexto e serão confrontadas com os dados, podendo ser aprofundadas, revistas ou tensionadas; as formas de atuação dizem respeito à ação dos profissionais, e só as entrevistas poderão mostrá-las.</w:t>
       </w:r>
     </w:p>
     <w:p>
@@ -951,7 +962,7 @@
       </w:pPr>
       <w:r>
         <w:rPr/>
-        <w:t xml:space="preserve">O ineditismo da pesquisa se mostra em três planos que se apoiam mutuamente. No plano empírico-temporal, a investigação acompanha a chegada da PNED à escola no momento em que a exigência curricular se torna obrigatória e ocupa uma lacuna identificada pela RSL, e Ball (2011, p. 38) lembra que a abordagem da trajetória “capta as formas pelas quais as políticas evoluem, se modificam e decaem ao longo do tempo e do espaço, assim como as suas incoerências”. No plano analítico-espacial, o território de Pipa entra na análise como dimensão constitutiva do contexto da prática, com o peso que Santos e Massey lhe atribuem. No plano teórico-conceitual, a tese articula a teoria da atuação, as culturas profissionais, a dimensão material da escola e a leitura do território, propõe a noção de habitar o digital e trata a distância entre a norma e a sala de aula como parte de uma relação política entre texto, contexto e sujeitos, sem classificá-la de imediato como falha, incapacidade ou resistência. É nesse encontro entre a PNED, uma escola, seus profissionais, suas condições materiais e um território específico que se torna possível perguntar quem consegue habitar o digital, em que condições e com quais possibilidades de participação.</w:t>
+        <w:t>O ineditismo da pesquisa se mostra em três planos que se apoiam mutuamente. No plano empírico-temporal, a investigação acompanha a chegada da PNED à escola no momento em que a exigência curricular se torna obrigatória e ocupa uma lacuna identificada pela RSL, e Ball (2011, p. 38) lembra que a abordagem da trajetória “capta as formas pelas quais as políticas evoluem, se modificam e decaem ao longo do tempo e do espaço, assim como as suas incoerências”. No plano analítico-espacial, o território municipal, de Tibau do Sul a Pipa, entra na análise como dimensão constitutiva do contexto, com o peso que Santos e Massey lhe atribuem, e a política é acompanhada por uma rede municipal de pequeno porte e diversa, situação que o corpus da RSL não reúne. No plano teórico-conceitual, a tese articula a teoria da atuação, as culturas profissionais, a dimensão material da escola e a leitura do território, propõe a noção de habitar o digital e trata a distância entre a norma e a sala de aula como parte de uma relação política entre texto, contexto e sujeitos, sem classificá-la de imediato como falha, incapacidade ou resistência. É nesse encontro entre a PNED, uma rede municipal, uma de suas escolas, seus profissionais, suas condições materiais e um território específico que se torna possível perguntar quem consegue habitar o digital, em que condições e com quais possibilidades de participação.</w:t>
       </w:r>
     </w:p>
     <w:p>
@@ -965,7 +976,7 @@
           <w:b w:val="0"/>
           <w:i w:val="0"/>
         </w:rPr>
-        <w:t>A análise se concentra em quem faz a mediação da política e nas condições institucionais de seu trabalho. Ficam fora do estudo o cumprimento integral da PNED e seus efeitos sobre a aprendizagem, questões que dependem de outros desenhos de pesquisa e de mais tempo de acompanhamento.</w:t>
+        <w:t>A análise se concentra em quem faz a mediação da política, na Secretaria e na escola, e nas condições institucionais de seu trabalho. As demais escolas da rede entram pelos documentos municipais e pelos dados do Censo Escolar, sem que seus profissionais sejam ouvidos. Ficam fora do estudo o cumprimento integral da PNED e seus efeitos sobre a aprendizagem, questões que dependem de outros desenhos de pesquisa e de mais tempo de acompanhamento.</w:t>
       </w:r>
     </w:p>
     <w:p>
@@ -1040,7 +1051,7 @@
           <w:b w:val="0"/>
           <w:i w:val="0"/>
         </w:rPr>
-        <w:t>No sexto capítulo, “Onde a política desembarca: o território de Pipa como contexto da prática da educação digital”, damos materialidade às dimensões situacional e material do contexto e oferecemos a base para o objetivo específico (b), apresentando a história e as transformações do distrito, a diversidade de quem a escola atende e as condições materiais da escola, onde documentamos o habitar o digital e a rugosidade tecnológica. No sétimo, “A PNED no contexto da prática: narrativas dos profissionais da educação”, respondemos aos quatro objetivos específicos, analisando como os profissionais leem a política, como a traduzem nas condições da escola e do território, que formas de atuação produzem diante dela e o que essas formas significam para os direitos das crianças. No oitavo capítulo, apresentamos as considerações finais, retomando a questão norteadora e os objetivos, sistematizando os achados e apontando as contribuições, as limitações do estudo e as possibilidades para investigações futuras.</w:t>
+        <w:t>No sexto capítulo, “Onde a política desembarca: de Tibau do Sul a Pipa, o território como contexto da prática da educação digital”, percorremos em funil o caminho do município à escola: as localidades de Tibau do Sul, das áreas rurais à comunidade quilombola de Sibaúma; a rede municipal e a Secretaria de Educação diante da PNED, com os documentos já disponíveis; a história e as transformações de Pipa e a diversidade de quem a escola atende; e as condições materiais da escola, onde documentamos o habitar o digital e a rugosidade tecnológica. O capítulo dá materialidade às dimensões situacional, material e externa do contexto e oferece a base para os objetivos específicos (a) e (c). No sétimo, “A PNED no contexto da prática: narrativas dos profissionais da educação”, respondemos aos quatro objetivos específicos, analisando como os profissionais leem a política, como a traduzem nas condições da escola e do território, que formas de atuação produzem diante dela e o que essas formas significam para os direitos das crianças. No oitavo capítulo, apresentamos as considerações finais, retomando a questão norteadora e os objetivos, sistematizando os achados e apontando as contribuições, as limitações do estudo e as possibilidades para investigações futuras.</w:t>
       </w:r>
     </w:p>
     <w:p>
@@ -1292,6 +1303,34 @@
           <w:b w:val="0"/>
           <w:i w:val="0"/>
         </w:rPr>
+        <w:t>BRASIL. Conselho Nacional de Educação. Câmara de Educação Básica. Resolução nº 8, de 20 de novembro de 2012. Define Diretrizes Curriculares Nacionais para a Educação Escolar Quilombola na Educação Básica. Brasília, DF: CNE, 2012.</w:t>
+      </w:r>
+    </w:p>
+    <w:p>
+      <w:pPr>
+        <w:spacing w:line="240" w:lineRule="auto" w:after="240" w:before="0"/>
+        <w:ind w:firstLine="0"/>
+        <w:jc w:val="left"/>
+      </w:pPr>
+      <w:r>
+        <w:rPr>
+          <w:b w:val="0"/>
+          <w:i w:val="0"/>
+        </w:rPr>
+        <w:t>BRASIL. Lei nº 9.394, de 20 de dezembro de 1996. Estabelece as diretrizes e bases da educação nacional. Brasília, DF: Presidência da República, 1996.</w:t>
+      </w:r>
+    </w:p>
+    <w:p>
+      <w:pPr>
+        <w:spacing w:line="240" w:lineRule="auto" w:after="240" w:before="0"/>
+        <w:ind w:firstLine="0"/>
+        <w:jc w:val="left"/>
+      </w:pPr>
+      <w:r>
+        <w:rPr>
+          <w:b w:val="0"/>
+          <w:i w:val="0"/>
+        </w:rPr>
         <w:t>BRASIL. Lei nº 14.533, de 11 de janeiro de 2023. Institui a Política Nacional de Educação Digital. Brasília, DF: Presidência da República, 2023.</w:t>
       </w:r>
     </w:p>
@@ -1586,6 +1625,48 @@
           <w:b w:val="0"/>
           <w:i w:val="0"/>
         </w:rPr>
+        <w:t>FUNDAÇÃO CULTURAL PALMARES. Portaria nº 26, de 6 de junho de 2005. Diário Oficial da União: seção 1, Brasília, DF, 8 jun. 2005. [conferir seção, página e ementa no DOU]</w:t>
+      </w:r>
+    </w:p>
+    <w:p>
+      <w:pPr>
+        <w:spacing w:line="240" w:lineRule="auto" w:after="240" w:before="0"/>
+        <w:ind w:firstLine="0"/>
+        <w:jc w:val="left"/>
+      </w:pPr>
+      <w:r>
+        <w:rPr>
+          <w:b w:val="0"/>
+          <w:i w:val="0"/>
+        </w:rPr>
+        <w:t xml:space="preserve">FREIRE, Paulo. </w:t>
+      </w:r>
+      <w:r>
+        <w:rPr>
+          <w:b/>
+          <w:i w:val="0"/>
+        </w:rPr>
+        <w:t>Pedagogia da autonomia</w:t>
+      </w:r>
+      <w:r>
+        <w:rPr>
+          <w:b w:val="0"/>
+          <w:i w:val="0"/>
+        </w:rPr>
+        <w:t>: saberes necessários à prática educativa. 60. ed. Rio de Janeiro: Paz e Terra, 2019.</w:t>
+      </w:r>
+    </w:p>
+    <w:p>
+      <w:pPr>
+        <w:spacing w:line="240" w:lineRule="auto" w:after="240" w:before="0"/>
+        <w:ind w:firstLine="0"/>
+        <w:jc w:val="left"/>
+      </w:pPr>
+      <w:r>
+        <w:rPr>
+          <w:b w:val="0"/>
+          <w:i w:val="0"/>
+        </w:rPr>
         <w:t xml:space="preserve">HALL, Stuart. </w:t>
       </w:r>
       <w:r>
@@ -1601,6 +1682,174 @@
           <w:i w:val="0"/>
         </w:rPr>
         <w:t>. 11. ed. Rio de Janeiro: DP&amp;A, 2006.</w:t>
+      </w:r>
+    </w:p>
+    <w:p>
+      <w:pPr>
+        <w:spacing w:line="240" w:lineRule="auto" w:after="240" w:before="0"/>
+        <w:ind w:firstLine="0"/>
+        <w:jc w:val="left"/>
+      </w:pPr>
+      <w:r>
+        <w:rPr>
+          <w:b w:val="0"/>
+          <w:i w:val="0"/>
+        </w:rPr>
+        <w:t xml:space="preserve">HARGREAVES, Andy. </w:t>
+      </w:r>
+      <w:r>
+        <w:rPr>
+          <w:b/>
+          <w:i w:val="0"/>
+        </w:rPr>
+        <w:t>Profesorado, cultura y postmodernidad</w:t>
+      </w:r>
+      <w:r>
+        <w:rPr>
+          <w:b w:val="0"/>
+          <w:i w:val="0"/>
+        </w:rPr>
+        <w:t>: cambian los tiempos, cambia el profesorado. 5. ed. Madrid: Morata, 2005.</w:t>
+      </w:r>
+    </w:p>
+    <w:p>
+      <w:pPr>
+        <w:spacing w:line="240" w:lineRule="auto" w:after="240" w:before="0"/>
+        <w:ind w:firstLine="0"/>
+        <w:jc w:val="left"/>
+      </w:pPr>
+      <w:r>
+        <w:rPr>
+          <w:b w:val="0"/>
+          <w:i w:val="0"/>
+        </w:rPr>
+        <w:t xml:space="preserve">IBGE. </w:t>
+      </w:r>
+      <w:r>
+        <w:rPr>
+          <w:b/>
+          <w:i w:val="0"/>
+        </w:rPr>
+        <w:t>Censo Demográfico 2010</w:t>
+      </w:r>
+      <w:r>
+        <w:rPr>
+          <w:b w:val="0"/>
+          <w:i w:val="0"/>
+        </w:rPr>
+        <w:t>: características da população e dos domicílios: resultados do universo. Rio de Janeiro: IBGE, 2011.</w:t>
+      </w:r>
+    </w:p>
+    <w:p>
+      <w:pPr>
+        <w:spacing w:line="240" w:lineRule="auto" w:after="240" w:before="0"/>
+        <w:ind w:firstLine="0"/>
+        <w:jc w:val="left"/>
+      </w:pPr>
+      <w:r>
+        <w:rPr>
+          <w:b w:val="0"/>
+          <w:i w:val="0"/>
+        </w:rPr>
+        <w:t xml:space="preserve">HARGREAVES, Andy. </w:t>
+      </w:r>
+      <w:r>
+        <w:rPr>
+          <w:b/>
+          <w:i w:val="0"/>
+        </w:rPr>
+        <w:t>Profesorado, cultura y postmodernidad</w:t>
+      </w:r>
+      <w:r>
+        <w:rPr>
+          <w:b w:val="0"/>
+          <w:i w:val="0"/>
+        </w:rPr>
+        <w:t>: cambian los tiempos, cambia el profesorado. 5. ed. Madrid: Morata, 2005.</w:t>
+      </w:r>
+    </w:p>
+    <w:p>
+      <w:pPr>
+        <w:spacing w:line="240" w:lineRule="auto" w:after="240" w:before="0"/>
+        <w:ind w:firstLine="0"/>
+        <w:jc w:val="left"/>
+      </w:pPr>
+      <w:r>
+        <w:rPr>
+          <w:b w:val="0"/>
+          <w:i w:val="0"/>
+        </w:rPr>
+        <w:t xml:space="preserve">IBGE. </w:t>
+      </w:r>
+      <w:r>
+        <w:rPr>
+          <w:b/>
+          <w:i w:val="0"/>
+        </w:rPr>
+        <w:t>Censo Demográfico 2022</w:t>
+      </w:r>
+      <w:r>
+        <w:rPr>
+          <w:b w:val="0"/>
+          <w:i w:val="0"/>
+        </w:rPr>
+        <w:t>: população e domicílios: primeiros resultados. Rio de Janeiro: IBGE, 2023.</w:t>
+      </w:r>
+    </w:p>
+    <w:p>
+      <w:pPr>
+        <w:spacing w:line="240" w:lineRule="auto" w:after="240" w:before="0"/>
+        <w:ind w:firstLine="0"/>
+        <w:jc w:val="left"/>
+      </w:pPr>
+      <w:r>
+        <w:rPr>
+          <w:b w:val="0"/>
+          <w:i w:val="0"/>
+        </w:rPr>
+        <w:t xml:space="preserve">HARGREAVES, Andy. </w:t>
+      </w:r>
+      <w:r>
+        <w:rPr>
+          <w:b/>
+          <w:i w:val="0"/>
+        </w:rPr>
+        <w:t>Profesorado, cultura y postmodernidad</w:t>
+      </w:r>
+      <w:r>
+        <w:rPr>
+          <w:b w:val="0"/>
+          <w:i w:val="0"/>
+        </w:rPr>
+        <w:t>: cambian los tiempos, cambia el profesorado. 5. ed. Madrid: Morata, 2005.</w:t>
+      </w:r>
+    </w:p>
+    <w:p>
+      <w:pPr>
+        <w:spacing w:line="240" w:lineRule="auto" w:after="240" w:before="0"/>
+        <w:ind w:firstLine="0"/>
+        <w:jc w:val="left"/>
+      </w:pPr>
+      <w:r>
+        <w:rPr>
+          <w:b w:val="0"/>
+          <w:i w:val="0"/>
+        </w:rPr>
+        <w:t xml:space="preserve">IBGE. </w:t>
+      </w:r>
+      <w:r>
+        <w:rPr>
+          <w:b/>
+          <w:i w:val="0"/>
+        </w:rPr>
+        <w:t>Cidades@: Tibau do Sul</w:t>
+      </w:r>
+      <w:r>
+        <w:rPr>
+          <w:b w:val="0"/>
+          <w:i w:val="0"/>
+        </w:rPr>
+        <w:t>. Rio de Janeiro: IBGE, 2025. Disponível em: https://cidades.ibge.gov.br/brasil/rn/tibau-do-sul. Acesso em: [indicar a data de acesso].</w:t>
       </w:r>
     </w:p>
     <w:p>
@@ -2063,6 +2312,48 @@
           <w:i w:val="0"/>
         </w:rPr>
         <w:t>: vivências na educação contemporânea. São Leopoldo: Casa Leiria, 2021.</w:t>
+      </w:r>
+    </w:p>
+    <w:p>
+      <w:pPr>
+        <w:spacing w:line="240" w:lineRule="auto" w:after="240" w:before="0"/>
+        <w:ind w:firstLine="0"/>
+        <w:jc w:val="left"/>
+      </w:pPr>
+      <w:r>
+        <w:rPr>
+          <w:b w:val="0"/>
+          <w:i w:val="0"/>
+        </w:rPr>
+        <w:t xml:space="preserve">SCHLEMMER, Eliane; BACKES, Luciana; PALAGI, Ana Maria Marques. O habitar do ensinar e do aprender OnLIFE: vivências na educação contemporânea. In: SCHLEMMER, Eliane; BACKES, Luciana; BITTENCOURT, João Ricardo; PALAGI, Ana Maria Marques (org.). </w:t>
+      </w:r>
+      <w:r>
+        <w:rPr>
+          <w:b/>
+          <w:i w:val="0"/>
+        </w:rPr>
+        <w:t xml:space="preserve">O habitar do ensinar e do aprender OnLIFE</w:t>
+      </w:r>
+      <w:r>
+        <w:rPr>
+          <w:b w:val="0"/>
+          <w:i w:val="0"/>
+        </w:rPr>
+        <w:t xml:space="preserve">: vivências na educação contemporânea. São Leopoldo: Casa Leiria, 2021. p. 15-34.</w:t>
+      </w:r>
+    </w:p>
+    <w:p>
+      <w:pPr>
+        <w:spacing w:line="240" w:lineRule="auto" w:after="240" w:before="0"/>
+        <w:ind w:firstLine="0"/>
+        <w:jc w:val="left"/>
+      </w:pPr>
+      <w:r>
+        <w:rPr>
+          <w:b w:val="0"/>
+          <w:i w:val="0"/>
+        </w:rPr>
+        <w:t>TIBAU DO SUL. Lei nº 517, de 24 de junho de 2015. Aprova o Plano Municipal de Educação. Tibau do Sul: Câmara Municipal, 2015. [conferir ementa e órgão de publicação]</w:t>
       </w:r>
     </w:p>
     <w:p>

</xml_diff>

<commit_message>
Recoloca Pipa como foco da tese no projeto e nos capítulos
O caso passa a ser a encenação da PNED na escola de Pipa; o território
municipal e a Secretaria entram como percurso em funil e contexto.
Remove a formulação de unidades incorporadas e regenera os PDFs.

Co-Authored-By: Claude Opus 5.5 <noreply@anthropic.com>
Claude-Session: https://claude.ai/code/session_01HxStpW4pQoDfJdTDYr6zEC
</commit_message>
<xml_diff>
--- a/introducao_nova/1_INTRODUCAO_alinhada_ao_projeto.docx
+++ b/introducao_nova/1_INTRODUCAO_alinhada_ao_projeto.docx
@@ -238,7 +238,7 @@
           <w:b w:val="0"/>
           <w:i w:val="0"/>
         </w:rPr>
-        <w:t>Com esse recorte, definimos o objeto desta pesquisa: a encenação da Política Nacional de Educação Digital, em seu eixo Educação Digital Escolar, no município de Tibau do Sul, no litoral sul do Rio Grande do Norte, acompanhada da Secretaria Municipal de Educação até a Escola Municipal Domitila Castelo da Silva, em Pipa. O percurso tem a forma de um funil. Começa na rede municipal, onde a política nacional é recebida, interpretada e convertida em planos, formações e orientações para escolas situadas em realidades muito diferentes, e chega à escola, onde os profissionais da educação que atuam nos anos iniciais do Ensino Fundamental, do 1º ao 5º ano, a interpretam, traduzem e recontextualizam no contexto da prática. Chamamos de profissionais da educação as professoras e os professores do 1º ao 5º ano, a coordenação pedagógica, a direção e os demais profissionais ligados aos processos pedagógicos ou à educação digital. Interessa-nos saber se e como a Secretaria considera a diversidade do território municipal ao traduzir a política e que peso têm, na escola, as culturas profissionais, as condições materiais e institucionais e as especificidades socioespaciais do lugar. O território, o funcionamento da rede e da escola e as condições de infraestrutura entram, assim, na análise como dimensões do contexto, e os documentos municipais, a entrevista com o técnico da Secretaria e as narrativas dos profissionais da escola constituem os caminhos para compreender como a política ganha forma no cotidiano escolar.</w:t>
+        <w:t>Com esse recorte, definimos o objeto desta pesquisa: a encenação da Política Nacional de Educação Digital, em seu eixo Educação Digital Escolar, na Escola Municipal Domitila Castelo da Silva, em Pipa, no município de Tibau do Sul, litoral sul do Rio Grande do Norte. Para chegar a Pipa, a pesquisa percorre um caminho em forma de funil. Começa na rede municipal, onde a política nacional é recebida, interpretada e convertida em planos, formações e orientações para escolas situadas em realidades muito diferentes, e chega à escola, onde os profissionais da educação que atuam nos anos iniciais do Ensino Fundamental, do 1º ao 5º ano, a interpretam, traduzem e recontextualizam no contexto da prática. Chamamos de profissionais da educação as professoras e os professores do 1º ao 5º ano, a coordenação pedagógica, a direção e os demais profissionais ligados aos processos pedagógicos ou à educação digital. Interessa-nos saber se e como a Secretaria considera a diversidade do território municipal ao traduzir a política e que peso têm, na escola, as culturas profissionais, as condições materiais e institucionais e as especificidades socioespaciais do lugar. O território, o funcionamento da rede e da escola e as condições de infraestrutura entram, assim, na análise como dimensões do contexto, e os documentos municipais, a entrevista com o técnico da Secretaria e as narrativas dos profissionais da escola constituem os caminhos para compreender como a política ganha forma no cotidiano escolar.</w:t>
       </w:r>
     </w:p>
     <w:p>
@@ -614,7 +614,7 @@
           <w:b w:val="0"/>
           <w:i w:val="0"/>
         </w:rPr>
-        <w:t>a) analisar a recontextualização da PNED pela Secretaria Municipal de Educação em planos, currículos, formações e orientações para a rede, considerando as especificidades das localidades do município, entre elas as áreas rurais e a comunidade quilombola de Sibaúma;</w:t>
+        <w:t>a) analisar a recontextualização da PNED pela Secretaria Municipal de Educação em planos, currículos, formações e orientações para a rede, considerando as especificidades das localidades do município, entre elas as áreas rurais e a comunidade quilombola de Sibaúma, até chegar a Pipa;</w:t>
       </w:r>
     </w:p>
     <w:p>
@@ -667,7 +667,7 @@
       </w:pPr>
       <w:r>
         <w:rPr/>
-        <w:t>Os quatro objetivos acompanham, em forma de funil, o caminho que a política percorre até chegar às crianças. O primeiro se detém na rede municipal e pergunta como a Secretaria converte a PNED em planos, formações e orientações e se esses materiais consideram as diferenças entre as localidades do município, das áreas rurais à comunidade quilombola de Sibaúma; é nele que a dimensão externa do contexto ganha fonte própria. O segundo chega aos sujeitos da escola e ao modo como leem a política e as orientações municipais a partir do que já sabem, acreditam e praticam, e por isso dialoga com a discussão de Hargreaves (2005) sobre as culturas do trabalho docente. O terceiro leva essa leitura às condições em que ela acontece, dentro da escola e em Pipa, naquilo que Ball, Maguire e Braun (2016, p. 38) chamam de contextos situados, que incluem a localidade, as histórias escolares e as matrículas. O quarto reúne os anteriores para perguntar o que os profissionais efetivamente fazem com a PNED, sem estabelecer previamente qual forma de atuação deve prevalecer, e acompanha a política até as crianças, a quem ela se dirige e em nome de quem se justifica, examinando como essas formas de atuação ampliam, limitam ou reorganizam as possibilidades de provisão, proteção e participação no ambiente digital (ONU, 2021). As crianças não participam da produção de dados, e o que se poderá dizer sobre elas virá das condições documentadas e das compreensões dos profissionais.</w:t>
+        <w:t>Os quatro objetivos acompanham, em forma de funil, o caminho que a política percorre até chegar às crianças. O primeiro se detém na rede municipal e pergunta como a Secretaria converte a PNED em planos, formações e orientações e se esses materiais consideram as diferenças entre as localidades do município, das áreas rurais à comunidade quilombola de Sibaúma, até chegar ao que é previsto para Pipa; é nele que a dimensão externa do contexto ganha fonte própria. O segundo chega aos sujeitos da escola e ao modo como leem a política e as orientações municipais a partir do que já sabem, acreditam e praticam, e por isso dialoga com a discussão de Hargreaves (2005) sobre as culturas do trabalho docente. O terceiro leva essa leitura às condições em que ela acontece, dentro da escola e em Pipa, naquilo que Ball, Maguire e Braun (2016, p. 38) chamam de contextos situados, que incluem a localidade, as histórias escolares e as matrículas. O quarto reúne os anteriores para perguntar o que os profissionais efetivamente fazem com a PNED, sem estabelecer previamente qual forma de atuação deve prevalecer, e acompanha a política até as crianças, a quem ela se dirige e em nome de quem se justifica, examinando como essas formas de atuação ampliam, limitam ou reorganizam as possibilidades de provisão, proteção e participação no ambiente digital (ONU, 2021). As crianças não participam da produção de dados, e o que se poderá dizer sobre elas virá das condições documentadas e das compreensões dos profissionais.</w:t>
       </w:r>
     </w:p>
     <w:p>
@@ -728,7 +728,7 @@
       </w:pPr>
       <w:r>
         <w:rPr/>
-        <w:t>Para responder à questão, adotamos abordagem qualitativa, de natureza interpretativa (MINAYO, 2009), e organizamos a investigação como estudo de caso único com unidades incorporadas (YIN, 2001) [indicar a página na edição usada]. Yin (2001, p. 32) define o estudo de caso como “uma investigação empírica que investiga um fenômeno contemporâneo dentro de seu contexto da vida real, especialmente quando os limites entre o fenômeno e o contexto não estão claramente definidos”. É a situação desta pesquisa, na qual infraestrutura, formação, cultura escolar e desigualdades do território condicionam a política e fazem parte dela ao mesmo tempo. O caso é a encenação da PNED na rede municipal de Tibau do Sul, e as unidades de análise são a Secretaria Municipal de Educação, onde a política é traduzida para o município, e a Escola Municipal Domitila Castelo da Silva, onde ela chega ao contexto da prática. A análise parte da rede e do território municipal e se estreita até a escola, a única instituição de ensino em que os profissionais serão ouvidos. O caso interessa pelo que permite compreender a fundo de uma realidade singular, sem pretensão de representar outras redes ou escolas.</w:t>
+        <w:t>Para responder à questão, adotamos abordagem qualitativa, de natureza interpretativa (MINAYO, 2009), e organizamos a investigação como estudo de caso único. Yin (2001, p. 32) define o estudo de caso como “uma investigação empírica que investiga um fenômeno contemporâneo dentro de seu contexto da vida real, especialmente quando os limites entre o fenômeno e o contexto não estão claramente definidos”. É a situação desta pesquisa, na qual infraestrutura, formação, cultura escolar e desigualdades do território condicionam a política e fazem parte dela ao mesmo tempo. O caso é a encenação da PNED na Escola Municipal Domitila Castelo da Silva, em Pipa. Para chegar a ele, a pesquisa lê o território municipal e os documentos da Secretaria Municipal de Educação e se estreita até Pipa e até a escola, a única instituição de ensino em que os profissionais serão ouvidos; a rede e a Secretaria entram como contexto da escola. O caso interessa pelo que permite compreender a fundo de uma realidade singular, sem pretensão de representar outras redes ou escolas.</w:t>
       </w:r>
     </w:p>
     <w:p>
@@ -962,7 +962,7 @@
       </w:pPr>
       <w:r>
         <w:rPr/>
-        <w:t>O ineditismo da pesquisa se mostra em três planos que se apoiam mutuamente. No plano empírico-temporal, a investigação acompanha a chegada da PNED à escola no momento em que a exigência curricular se torna obrigatória e ocupa uma lacuna identificada pela RSL, e Ball (2011, p. 38) lembra que a abordagem da trajetória “capta as formas pelas quais as políticas evoluem, se modificam e decaem ao longo do tempo e do espaço, assim como as suas incoerências”. No plano analítico-espacial, o território municipal, de Tibau do Sul a Pipa, entra na análise como dimensão constitutiva do contexto, com o peso que Santos e Massey lhe atribuem, e a política é acompanhada por uma rede municipal de pequeno porte e diversa, situação que o corpus da RSL não reúne. No plano teórico-conceitual, a tese articula a teoria da atuação, as culturas profissionais, a dimensão material da escola e a leitura do território, propõe a noção de habitar o digital e trata a distância entre a norma e a sala de aula como parte de uma relação política entre texto, contexto e sujeitos, sem classificá-la de imediato como falha, incapacidade ou resistência. É nesse encontro entre a PNED, uma rede municipal, uma de suas escolas, seus profissionais, suas condições materiais e um território específico que se torna possível perguntar quem consegue habitar o digital, em que condições e com quais possibilidades de participação.</w:t>
+        <w:t>O ineditismo da pesquisa se mostra em três planos que se apoiam mutuamente. No plano empírico-temporal, a investigação acompanha a chegada da PNED à escola no momento em que a exigência curricular se torna obrigatória e ocupa uma lacuna identificada pela RSL, e Ball (2011, p. 38) lembra que a abordagem da trajetória “capta as formas pelas quais as políticas evoluem, se modificam e decaem ao longo do tempo e do espaço, assim como as suas incoerências”. No plano analítico-espacial, Pipa está no centro da análise, lida dentro de um território municipal diverso, com o peso que Santos e Massey atribuem ao território, e a política é acompanhada até ela por uma rede municipal de pequeno porte, situação que o corpus da RSL não reúne. No plano teórico-conceitual, a tese articula a teoria da atuação, as culturas profissionais, a dimensão material da escola e a leitura do território, propõe a noção de habitar o digital e trata a distância entre a norma e a sala de aula como parte de uma relação política entre texto, contexto e sujeitos, sem classificá-la de imediato como falha, incapacidade ou resistência. É nesse encontro entre a PNED, uma rede municipal, uma de suas escolas, seus profissionais, suas condições materiais e um território específico que se torna possível perguntar quem consegue habitar o digital, em que condições e com quais possibilidades de participação.</w:t>
       </w:r>
     </w:p>
     <w:p>

</xml_diff>